<commit_message>
adding Major version AI Full stack developer
</commit_message>
<xml_diff>
--- a/02 - Languages/Java/01 - Java Basics & JVM.docx
+++ b/02 - Languages/Java/01 - Java Basics & JVM.docx
@@ -759,6 +759,29 @@
           <w:szCs w:val="40"/>
         </w:rPr>
       </w:pPr>
+    </w:p>
+    <w:p>
+      <w:pPr>
+        <w:rPr>
+          <w:rFonts w:hint="default"/>
+          <w:b/>
+          <w:bCs/>
+          <w:sz w:val="40"/>
+          <w:szCs w:val="40"/>
+          <w:lang w:val="en-US"/>
+        </w:rPr>
+      </w:pPr>
+      <w:r>
+        <w:rPr>
+          <w:rFonts w:hint="default"/>
+          <w:b/>
+          <w:bCs/>
+          <w:sz w:val="40"/>
+          <w:szCs w:val="40"/>
+          <w:lang w:val="en-US"/>
+        </w:rPr>
+        <w:t>JRS = JAVA RUNTIME SYSTEM</w:t>
+      </w:r>
     </w:p>
     <w:p>
       <w:pPr>
@@ -3593,6 +3616,7 @@
         <w:keepLines w:val="0"/>
         <w:widowControl/>
         <w:suppressLineNumbers w:val="0"/>
+        <w:ind w:firstLine="720" w:firstLineChars="0"/>
         <w:rPr>
           <w:rStyle w:val="14"/>
           <w:rFonts w:hint="default"/>
@@ -3625,11 +3649,10 @@
         <w:keepLines w:val="0"/>
         <w:widowControl/>
         <w:numPr>
-          <w:ilvl w:val="0"/>
-          <w:numId w:val="2"/>
+          <w:numId w:val="0"/>
         </w:numPr>
         <w:suppressLineNumbers w:val="0"/>
-        <w:ind w:left="0" w:leftChars="0" w:firstLine="0" w:firstLineChars="0"/>
+        <w:ind w:leftChars="0" w:firstLine="720" w:firstLineChars="0"/>
         <w:rPr>
           <w:rFonts w:hint="default"/>
           <w:lang w:val="en-US"/>
@@ -3638,6 +3661,14 @@
       <w:r>
         <w:rPr>
           <w:rStyle w:val="14"/>
+          <w:rFonts w:hint="default"/>
+          <w:lang w:val="en-US"/>
+        </w:rPr>
+        <w:t>3 .</w:t>
+      </w:r>
+      <w:r>
+        <w:rPr>
+          <w:rStyle w:val="14"/>
         </w:rPr>
         <w:t>Metaspace</w:t>
       </w:r>
@@ -3652,7 +3683,7 @@
         <w:keepLines w:val="0"/>
         <w:widowControl/>
         <w:suppressLineNumbers w:val="0"/>
-        <w:ind w:firstLine="720" w:firstLineChars="0"/>
+        <w:ind w:left="720" w:leftChars="0" w:firstLine="720" w:firstLineChars="0"/>
         <w:rPr>
           <w:b w:val="0"/>
           <w:bCs w:val="0"/>
@@ -3677,6 +3708,106 @@
         <w:keepLines w:val="0"/>
         <w:widowControl/>
         <w:suppressLineNumbers w:val="0"/>
+        <w:ind w:left="1440" w:leftChars="0" w:firstLine="720" w:firstLineChars="0"/>
+        <w:rPr>
+          <w:b w:val="0"/>
+          <w:bCs w:val="0"/>
+          <w:sz w:val="22"/>
+          <w:szCs w:val="22"/>
+        </w:rPr>
+      </w:pPr>
+      <w:r>
+        <w:rPr>
+          <w:b w:val="0"/>
+          <w:bCs w:val="0"/>
+          <w:sz w:val="22"/>
+          <w:szCs w:val="22"/>
+        </w:rPr>
+        <w:t>Class metadata</w:t>
+      </w:r>
+    </w:p>
+    <w:p>
+      <w:pPr>
+        <w:pStyle w:val="13"/>
+        <w:keepNext w:val="0"/>
+        <w:keepLines w:val="0"/>
+        <w:widowControl/>
+        <w:suppressLineNumbers w:val="0"/>
+        <w:ind w:left="1440" w:leftChars="0" w:firstLine="720" w:firstLineChars="0"/>
+        <w:rPr>
+          <w:b w:val="0"/>
+          <w:bCs w:val="0"/>
+          <w:sz w:val="22"/>
+          <w:szCs w:val="22"/>
+        </w:rPr>
+      </w:pPr>
+      <w:r>
+        <w:rPr>
+          <w:b w:val="0"/>
+          <w:bCs w:val="0"/>
+          <w:sz w:val="22"/>
+          <w:szCs w:val="22"/>
+        </w:rPr>
+        <w:t>Method metadata</w:t>
+      </w:r>
+    </w:p>
+    <w:p>
+      <w:pPr>
+        <w:pStyle w:val="13"/>
+        <w:keepNext w:val="0"/>
+        <w:keepLines w:val="0"/>
+        <w:widowControl/>
+        <w:suppressLineNumbers w:val="0"/>
+        <w:ind w:left="1440" w:leftChars="0" w:firstLine="720" w:firstLineChars="0"/>
+        <w:rPr>
+          <w:b w:val="0"/>
+          <w:bCs w:val="0"/>
+          <w:sz w:val="22"/>
+          <w:szCs w:val="22"/>
+        </w:rPr>
+      </w:pPr>
+      <w:r>
+        <w:rPr>
+          <w:b w:val="0"/>
+          <w:bCs w:val="0"/>
+          <w:sz w:val="22"/>
+          <w:szCs w:val="22"/>
+        </w:rPr>
+        <w:t>Runtime constant pool</w:t>
+      </w:r>
+    </w:p>
+    <w:p>
+      <w:pPr>
+        <w:pStyle w:val="13"/>
+        <w:keepNext w:val="0"/>
+        <w:keepLines w:val="0"/>
+        <w:widowControl/>
+        <w:suppressLineNumbers w:val="0"/>
+        <w:ind w:left="1440" w:leftChars="0" w:firstLine="720" w:firstLineChars="0"/>
+        <w:rPr>
+          <w:b w:val="0"/>
+          <w:bCs w:val="0"/>
+          <w:sz w:val="22"/>
+          <w:szCs w:val="22"/>
+        </w:rPr>
+      </w:pPr>
+      <w:r>
+        <w:rPr>
+          <w:b w:val="0"/>
+          <w:bCs w:val="0"/>
+          <w:sz w:val="22"/>
+          <w:szCs w:val="22"/>
+        </w:rPr>
+        <w:t>Static variables (class-level)</w:t>
+      </w:r>
+    </w:p>
+    <w:p>
+      <w:pPr>
+        <w:pStyle w:val="13"/>
+        <w:keepNext w:val="0"/>
+        <w:keepLines w:val="0"/>
+        <w:widowControl/>
+        <w:suppressLineNumbers w:val="0"/>
         <w:ind w:left="720" w:leftChars="0" w:firstLine="720" w:firstLineChars="0"/>
         <w:rPr>
           <w:b w:val="0"/>
@@ -3692,106 +3823,6 @@
           <w:sz w:val="22"/>
           <w:szCs w:val="22"/>
         </w:rPr>
-        <w:t>Class metadata</w:t>
-      </w:r>
-    </w:p>
-    <w:p>
-      <w:pPr>
-        <w:pStyle w:val="13"/>
-        <w:keepNext w:val="0"/>
-        <w:keepLines w:val="0"/>
-        <w:widowControl/>
-        <w:suppressLineNumbers w:val="0"/>
-        <w:ind w:left="720" w:leftChars="0" w:firstLine="720" w:firstLineChars="0"/>
-        <w:rPr>
-          <w:b w:val="0"/>
-          <w:bCs w:val="0"/>
-          <w:sz w:val="22"/>
-          <w:szCs w:val="22"/>
-        </w:rPr>
-      </w:pPr>
-      <w:r>
-        <w:rPr>
-          <w:b w:val="0"/>
-          <w:bCs w:val="0"/>
-          <w:sz w:val="22"/>
-          <w:szCs w:val="22"/>
-        </w:rPr>
-        <w:t>Method metadata</w:t>
-      </w:r>
-    </w:p>
-    <w:p>
-      <w:pPr>
-        <w:pStyle w:val="13"/>
-        <w:keepNext w:val="0"/>
-        <w:keepLines w:val="0"/>
-        <w:widowControl/>
-        <w:suppressLineNumbers w:val="0"/>
-        <w:ind w:left="720" w:leftChars="0" w:firstLine="720" w:firstLineChars="0"/>
-        <w:rPr>
-          <w:b w:val="0"/>
-          <w:bCs w:val="0"/>
-          <w:sz w:val="22"/>
-          <w:szCs w:val="22"/>
-        </w:rPr>
-      </w:pPr>
-      <w:r>
-        <w:rPr>
-          <w:b w:val="0"/>
-          <w:bCs w:val="0"/>
-          <w:sz w:val="22"/>
-          <w:szCs w:val="22"/>
-        </w:rPr>
-        <w:t>Runtime constant pool</w:t>
-      </w:r>
-    </w:p>
-    <w:p>
-      <w:pPr>
-        <w:pStyle w:val="13"/>
-        <w:keepNext w:val="0"/>
-        <w:keepLines w:val="0"/>
-        <w:widowControl/>
-        <w:suppressLineNumbers w:val="0"/>
-        <w:ind w:left="720" w:leftChars="0" w:firstLine="720" w:firstLineChars="0"/>
-        <w:rPr>
-          <w:b w:val="0"/>
-          <w:bCs w:val="0"/>
-          <w:sz w:val="22"/>
-          <w:szCs w:val="22"/>
-        </w:rPr>
-      </w:pPr>
-      <w:r>
-        <w:rPr>
-          <w:b w:val="0"/>
-          <w:bCs w:val="0"/>
-          <w:sz w:val="22"/>
-          <w:szCs w:val="22"/>
-        </w:rPr>
-        <w:t>Static variables (class-level)</w:t>
-      </w:r>
-    </w:p>
-    <w:p>
-      <w:pPr>
-        <w:pStyle w:val="13"/>
-        <w:keepNext w:val="0"/>
-        <w:keepLines w:val="0"/>
-        <w:widowControl/>
-        <w:suppressLineNumbers w:val="0"/>
-        <w:ind w:firstLine="720" w:firstLineChars="0"/>
-        <w:rPr>
-          <w:b w:val="0"/>
-          <w:bCs w:val="0"/>
-          <w:sz w:val="22"/>
-          <w:szCs w:val="22"/>
-        </w:rPr>
-      </w:pPr>
-      <w:r>
-        <w:rPr>
-          <w:b w:val="0"/>
-          <w:bCs w:val="0"/>
-          <w:sz w:val="22"/>
-          <w:szCs w:val="22"/>
-        </w:rPr>
         <w:t>Key points:</w:t>
       </w:r>
     </w:p>
@@ -3802,7 +3833,7 @@
         <w:keepLines w:val="0"/>
         <w:widowControl/>
         <w:suppressLineNumbers w:val="0"/>
-        <w:ind w:left="720" w:leftChars="0" w:firstLine="720" w:firstLineChars="0"/>
+        <w:ind w:left="1440" w:leftChars="0" w:firstLine="720" w:firstLineChars="0"/>
         <w:rPr>
           <w:b w:val="0"/>
           <w:bCs w:val="0"/>
@@ -3846,7 +3877,7 @@
         <w:keepLines w:val="0"/>
         <w:widowControl/>
         <w:suppressLineNumbers w:val="0"/>
-        <w:ind w:left="720" w:leftChars="0" w:firstLine="720" w:firstLineChars="0"/>
+        <w:ind w:left="1440" w:leftChars="0" w:firstLine="720" w:firstLineChars="0"/>
         <w:rPr>
           <w:b w:val="0"/>
           <w:bCs w:val="0"/>
@@ -3871,7 +3902,7 @@
         <w:keepLines w:val="0"/>
         <w:widowControl/>
         <w:suppressLineNumbers w:val="0"/>
-        <w:ind w:left="720" w:leftChars="0" w:firstLine="720" w:firstLineChars="0"/>
+        <w:ind w:left="1440" w:leftChars="0" w:firstLine="720" w:firstLineChars="0"/>
         <w:rPr>
           <w:b w:val="0"/>
           <w:bCs w:val="0"/>
@@ -3915,6 +3946,7 @@
         <w:keepLines w:val="0"/>
         <w:widowControl/>
         <w:suppressLineNumbers w:val="0"/>
+        <w:ind w:left="720" w:leftChars="0" w:firstLine="720" w:firstLineChars="0"/>
         <w:rPr>
           <w:rFonts w:hint="default"/>
           <w:b w:val="0"/>
@@ -5221,6 +5253,7 @@
             <w:insideH w:val="none" w:color="auto" w:sz="0" w:space="0"/>
             <w:insideV w:val="none" w:color="auto" w:sz="0" w:space="0"/>
           </w:tblBorders>
+          <w:shd w:val="clear" w:color="auto" w:fill="auto"/>
           <w:tblCellMar>
             <w:top w:w="15" w:type="dxa"/>
             <w:left w:w="15" w:type="dxa"/>
@@ -5368,6 +5401,7 @@
             <w:insideH w:val="none" w:color="auto" w:sz="0" w:space="0"/>
             <w:insideV w:val="none" w:color="auto" w:sz="0" w:space="0"/>
           </w:tblBorders>
+          <w:shd w:val="clear" w:color="auto" w:fill="auto"/>
           <w:tblCellMar>
             <w:top w:w="15" w:type="dxa"/>
             <w:left w:w="15" w:type="dxa"/>
@@ -5441,6 +5475,7 @@
             <w:insideH w:val="none" w:color="auto" w:sz="0" w:space="0"/>
             <w:insideV w:val="none" w:color="auto" w:sz="0" w:space="0"/>
           </w:tblBorders>
+          <w:shd w:val="clear" w:color="auto" w:fill="auto"/>
           <w:tblCellMar>
             <w:top w:w="15" w:type="dxa"/>
             <w:left w:w="15" w:type="dxa"/>
@@ -5514,6 +5549,7 @@
             <w:insideH w:val="none" w:color="auto" w:sz="0" w:space="0"/>
             <w:insideV w:val="none" w:color="auto" w:sz="0" w:space="0"/>
           </w:tblBorders>
+          <w:shd w:val="clear" w:color="auto" w:fill="auto"/>
           <w:tblCellMar>
             <w:top w:w="15" w:type="dxa"/>
             <w:left w:w="15" w:type="dxa"/>
@@ -8899,90 +8935,562 @@
         <w:rPr>
           <w:b w:val="0"/>
           <w:bCs w:val="0"/>
+          <w:sz w:val="36"/>
+          <w:szCs w:val="36"/>
+        </w:rPr>
+      </w:pPr>
+      <w:r>
+        <w:rPr>
+          <w:b w:val="0"/>
+          <w:bCs w:val="0"/>
+          <w:sz w:val="36"/>
+          <w:szCs w:val="36"/>
+        </w:rPr>
+        <w:t>Java Variables</w:t>
+      </w:r>
+    </w:p>
+    <w:p>
+      <w:pPr>
+        <w:bidi w:val="0"/>
+        <w:rPr>
+          <w:sz w:val="24"/>
+          <w:szCs w:val="24"/>
+        </w:rPr>
+      </w:pPr>
+      <w:r>
+        <w:rPr>
+          <w:sz w:val="24"/>
+          <w:szCs w:val="24"/>
+        </w:rPr>
+        <w:t>5 types of variables</w:t>
+      </w:r>
+    </w:p>
+    <w:p>
+      <w:pPr>
+        <w:bidi w:val="0"/>
+        <w:rPr>
+          <w:sz w:val="24"/>
+          <w:szCs w:val="24"/>
+          <w:highlight w:val="yellow"/>
+        </w:rPr>
+      </w:pPr>
+      <w:r>
+        <w:rPr>
+          <w:sz w:val="24"/>
+          <w:szCs w:val="24"/>
+          <w:highlight w:val="yellow"/>
+        </w:rPr>
+        <w:t>String </w:t>
+      </w:r>
+    </w:p>
+    <w:p>
+      <w:pPr>
+        <w:bidi w:val="0"/>
+        <w:rPr>
+          <w:sz w:val="24"/>
+          <w:szCs w:val="24"/>
+          <w:highlight w:val="yellow"/>
+        </w:rPr>
+      </w:pPr>
+      <w:r>
+        <w:rPr>
+          <w:sz w:val="24"/>
+          <w:szCs w:val="24"/>
+          <w:highlight w:val="yellow"/>
+        </w:rPr>
+        <w:t>int -</w:t>
+      </w:r>
+    </w:p>
+    <w:p>
+      <w:pPr>
+        <w:bidi w:val="0"/>
+        <w:rPr>
+          <w:sz w:val="24"/>
+          <w:szCs w:val="24"/>
+        </w:rPr>
+      </w:pPr>
+      <w:r>
+        <w:rPr>
+          <w:sz w:val="24"/>
+          <w:szCs w:val="24"/>
+          <w:highlight w:val="yellow"/>
+        </w:rPr>
+        <w:t>float</w:t>
+      </w:r>
+      <w:r>
+        <w:rPr>
+          <w:sz w:val="24"/>
+          <w:szCs w:val="24"/>
+        </w:rPr>
+        <w:t xml:space="preserve"> - stores floating point numbers, with decimals, </w:t>
+      </w:r>
+      <w:r>
+        <w:rPr>
+          <w:rFonts w:hint="default"/>
+          <w:sz w:val="24"/>
+          <w:szCs w:val="24"/>
+          <w:lang w:val="en-US"/>
+        </w:rPr>
+        <w:t>eg.</w:t>
+      </w:r>
+      <w:r>
+        <w:rPr>
+          <w:sz w:val="24"/>
+          <w:szCs w:val="24"/>
+        </w:rPr>
+        <w:t xml:space="preserve">19.99 or -19.99  </w:t>
+      </w:r>
+      <w:r>
+        <w:rPr>
+          <w:sz w:val="24"/>
+          <w:szCs w:val="24"/>
+          <w:highlight w:val="yellow"/>
+        </w:rPr>
+        <w:t xml:space="preserve">float mynum = 5.99f; </w:t>
+      </w:r>
+      <w:r>
+        <w:rPr>
+          <w:sz w:val="24"/>
+          <w:szCs w:val="24"/>
+        </w:rPr>
+        <w:br w:type="textWrapping"/>
+      </w:r>
+      <w:r>
+        <w:rPr>
+          <w:sz w:val="24"/>
+          <w:szCs w:val="24"/>
+          <w:highlight w:val="yellow"/>
+        </w:rPr>
+        <w:t xml:space="preserve">double </w:t>
+      </w:r>
+      <w:r>
+        <w:rPr>
+          <w:rFonts w:hint="default"/>
+          <w:sz w:val="24"/>
+          <w:szCs w:val="24"/>
+          <w:highlight w:val="yellow"/>
+          <w:lang w:val="en-US"/>
+        </w:rPr>
+        <w:t xml:space="preserve">- </w:t>
+      </w:r>
+      <w:r>
+        <w:rPr>
+          <w:sz w:val="24"/>
+          <w:szCs w:val="24"/>
+          <w:highlight w:val="yellow"/>
+        </w:rPr>
+        <w:t>mynum =19.99d;</w:t>
+      </w:r>
+    </w:p>
+    <w:p>
+      <w:pPr>
+        <w:bidi w:val="0"/>
+        <w:rPr>
+          <w:sz w:val="24"/>
+          <w:szCs w:val="24"/>
+          <w:highlight w:val="yellow"/>
+        </w:rPr>
+      </w:pPr>
+      <w:r>
+        <w:rPr>
+          <w:sz w:val="24"/>
+          <w:szCs w:val="24"/>
+          <w:highlight w:val="yellow"/>
+        </w:rPr>
+        <w:t xml:space="preserve">char - </w:t>
+      </w:r>
+    </w:p>
+    <w:p>
+      <w:pPr>
+        <w:bidi w:val="0"/>
+        <w:rPr>
+          <w:sz w:val="24"/>
+          <w:szCs w:val="24"/>
+          <w:highlight w:val="yellow"/>
+        </w:rPr>
+      </w:pPr>
+      <w:r>
+        <w:rPr>
+          <w:sz w:val="24"/>
+          <w:szCs w:val="24"/>
+          <w:highlight w:val="yellow"/>
+        </w:rPr>
+        <w:t xml:space="preserve">boolean - </w:t>
+      </w:r>
+    </w:p>
+    <w:p>
+      <w:pPr>
+        <w:bidi w:val="0"/>
+        <w:rPr>
+          <w:sz w:val="24"/>
+          <w:szCs w:val="24"/>
+          <w:highlight w:val="yellow"/>
+        </w:rPr>
+      </w:pPr>
+    </w:p>
+    <w:p>
+      <w:pPr>
+        <w:bidi w:val="0"/>
+        <w:rPr>
+          <w:sz w:val="24"/>
+          <w:szCs w:val="24"/>
+          <w:highlight w:val="yellow"/>
+        </w:rPr>
+      </w:pPr>
+    </w:p>
+    <w:p>
+      <w:pPr>
+        <w:pStyle w:val="2"/>
+        <w:keepNext w:val="0"/>
+        <w:keepLines w:val="0"/>
+        <w:widowControl/>
+        <w:suppressLineNumbers w:val="0"/>
+        <w:rPr>
+          <w:sz w:val="36"/>
+          <w:szCs w:val="36"/>
+        </w:rPr>
+      </w:pPr>
+      <w:r>
+        <w:rPr>
+          <w:sz w:val="36"/>
+          <w:szCs w:val="36"/>
+        </w:rPr>
+        <w:t>Important Syntax Difference</w:t>
+      </w:r>
+    </w:p>
+    <w:p>
+      <w:pPr>
+        <w:pStyle w:val="3"/>
+        <w:keepNext w:val="0"/>
+        <w:keepLines w:val="0"/>
+        <w:widowControl/>
+        <w:suppressLineNumbers w:val="0"/>
+      </w:pPr>
+      <w:r>
+        <w:t xml:space="preserve">Float needs </w:t>
+      </w:r>
+      <w:r>
+        <w:rPr>
+          <w:rStyle w:val="10"/>
+          <w:sz w:val="44"/>
+          <w:szCs w:val="44"/>
+          <w:highlight w:val="yellow"/>
+        </w:rPr>
+        <w:t>f</w:t>
+      </w:r>
+    </w:p>
+    <w:p>
+      <w:pPr>
+        <w:pStyle w:val="11"/>
+        <w:keepNext w:val="0"/>
+        <w:keepLines w:val="0"/>
+        <w:widowControl/>
+        <w:suppressLineNumbers w:val="0"/>
+        <w:rPr>
+          <w:rFonts w:hint="default"/>
+          <w:sz w:val="21"/>
+          <w:szCs w:val="21"/>
+          <w:highlight w:val="yellow"/>
+          <w:lang w:val="en-US"/>
+        </w:rPr>
+      </w:pPr>
+      <w:r>
+        <w:rPr>
+          <w:sz w:val="21"/>
+          <w:szCs w:val="21"/>
+          <w:highlight w:val="yellow"/>
+        </w:rPr>
+        <w:t>float</w:t>
+      </w:r>
+      <w:r>
+        <w:rPr>
+          <w:rStyle w:val="10"/>
+          <w:sz w:val="21"/>
+          <w:szCs w:val="21"/>
+          <w:highlight w:val="yellow"/>
+        </w:rPr>
+        <w:t xml:space="preserve"> </w:t>
+      </w:r>
+      <w:r>
+        <w:rPr>
+          <w:sz w:val="21"/>
+          <w:szCs w:val="21"/>
+          <w:highlight w:val="yellow"/>
+        </w:rPr>
+        <w:t>x</w:t>
+      </w:r>
+      <w:r>
+        <w:rPr>
+          <w:rStyle w:val="10"/>
+          <w:sz w:val="21"/>
+          <w:szCs w:val="21"/>
+          <w:highlight w:val="yellow"/>
+        </w:rPr>
+        <w:t xml:space="preserve"> </w:t>
+      </w:r>
+      <w:r>
+        <w:rPr>
+          <w:sz w:val="21"/>
+          <w:szCs w:val="21"/>
+          <w:highlight w:val="yellow"/>
+        </w:rPr>
+        <w:t>=</w:t>
+      </w:r>
+      <w:r>
+        <w:rPr>
+          <w:rStyle w:val="10"/>
+          <w:sz w:val="21"/>
+          <w:szCs w:val="21"/>
+          <w:highlight w:val="yellow"/>
+        </w:rPr>
+        <w:t xml:space="preserve"> </w:t>
+      </w:r>
+      <w:r>
+        <w:rPr>
+          <w:sz w:val="21"/>
+          <w:szCs w:val="21"/>
+          <w:highlight w:val="yellow"/>
+        </w:rPr>
+        <w:t>5.5f</w:t>
+      </w:r>
+      <w:r>
+        <w:rPr>
+          <w:rStyle w:val="10"/>
+          <w:sz w:val="21"/>
+          <w:szCs w:val="21"/>
+          <w:highlight w:val="yellow"/>
+        </w:rPr>
+        <w:t>;</w:t>
+      </w:r>
+      <w:r>
+        <w:rPr>
+          <w:rStyle w:val="10"/>
+          <w:sz w:val="21"/>
+          <w:szCs w:val="21"/>
+          <w:highlight w:val="yellow"/>
+        </w:rPr>
+        <w:br w:type="textWrapping"/>
+      </w:r>
+      <w:r>
+        <w:rPr>
+          <w:rStyle w:val="10"/>
+          <w:rFonts w:hint="default"/>
+          <w:sz w:val="21"/>
+          <w:szCs w:val="21"/>
+          <w:highlight w:val="yellow"/>
+          <w:lang w:val="en-US"/>
+        </w:rPr>
+        <w:t>less memory . small size</w:t>
+      </w:r>
+    </w:p>
+    <w:p>
+      <w:pPr>
+        <w:pStyle w:val="13"/>
+        <w:keepNext w:val="0"/>
+        <w:keepLines w:val="0"/>
+        <w:widowControl/>
+        <w:suppressLineNumbers w:val="0"/>
+        <w:rPr>
+          <w:sz w:val="28"/>
+          <w:szCs w:val="28"/>
+          <w:highlight w:val="yellow"/>
+        </w:rPr>
+      </w:pPr>
+      <w:r>
+        <w:rPr>
+          <w:sz w:val="28"/>
+          <w:szCs w:val="28"/>
+          <w:highlight w:val="yellow"/>
+        </w:rPr>
+        <w:t xml:space="preserve">Without </w:t>
+      </w:r>
+      <w:r>
+        <w:rPr>
+          <w:rStyle w:val="10"/>
+          <w:sz w:val="21"/>
+          <w:szCs w:val="21"/>
+          <w:highlight w:val="yellow"/>
+        </w:rPr>
+        <w:t>f</w:t>
+      </w:r>
+      <w:r>
+        <w:rPr>
+          <w:sz w:val="28"/>
+          <w:szCs w:val="28"/>
+          <w:highlight w:val="yellow"/>
+        </w:rPr>
+        <w:t>:</w:t>
+      </w:r>
+    </w:p>
+    <w:p>
+      <w:pPr>
+        <w:pStyle w:val="11"/>
+        <w:keepNext w:val="0"/>
+        <w:keepLines w:val="0"/>
+        <w:widowControl/>
+        <w:suppressLineNumbers w:val="0"/>
+        <w:rPr>
+          <w:sz w:val="21"/>
+          <w:szCs w:val="21"/>
+          <w:highlight w:val="yellow"/>
+        </w:rPr>
+      </w:pPr>
+      <w:r>
+        <w:rPr>
+          <w:sz w:val="21"/>
+          <w:szCs w:val="21"/>
+          <w:highlight w:val="yellow"/>
+        </w:rPr>
+        <w:t>float</w:t>
+      </w:r>
+      <w:r>
+        <w:rPr>
+          <w:rStyle w:val="10"/>
+          <w:sz w:val="21"/>
+          <w:szCs w:val="21"/>
+          <w:highlight w:val="yellow"/>
+        </w:rPr>
+        <w:t xml:space="preserve"> </w:t>
+      </w:r>
+      <w:r>
+        <w:rPr>
+          <w:sz w:val="21"/>
+          <w:szCs w:val="21"/>
+          <w:highlight w:val="yellow"/>
+        </w:rPr>
+        <w:t>x</w:t>
+      </w:r>
+      <w:r>
+        <w:rPr>
+          <w:rStyle w:val="10"/>
+          <w:sz w:val="21"/>
+          <w:szCs w:val="21"/>
+          <w:highlight w:val="yellow"/>
+        </w:rPr>
+        <w:t xml:space="preserve"> </w:t>
+      </w:r>
+      <w:r>
+        <w:rPr>
+          <w:sz w:val="21"/>
+          <w:szCs w:val="21"/>
+          <w:highlight w:val="yellow"/>
+        </w:rPr>
+        <w:t>=</w:t>
+      </w:r>
+      <w:r>
+        <w:rPr>
+          <w:rStyle w:val="10"/>
+          <w:sz w:val="21"/>
+          <w:szCs w:val="21"/>
+          <w:highlight w:val="yellow"/>
+        </w:rPr>
+        <w:t xml:space="preserve"> </w:t>
+      </w:r>
+      <w:r>
+        <w:rPr>
+          <w:sz w:val="21"/>
+          <w:szCs w:val="21"/>
+          <w:highlight w:val="yellow"/>
+        </w:rPr>
+        <w:t>5.5</w:t>
+      </w:r>
+      <w:r>
+        <w:rPr>
+          <w:rStyle w:val="10"/>
+          <w:sz w:val="21"/>
+          <w:szCs w:val="21"/>
+          <w:highlight w:val="yellow"/>
+        </w:rPr>
+        <w:t xml:space="preserve">; </w:t>
+      </w:r>
+      <w:r>
+        <w:rPr>
+          <w:sz w:val="21"/>
+          <w:szCs w:val="21"/>
+          <w:highlight w:val="yellow"/>
+        </w:rPr>
+        <w:t>// ERROR</w:t>
+      </w:r>
+    </w:p>
+    <w:p>
+      <w:pPr>
+        <w:pStyle w:val="13"/>
+        <w:keepNext w:val="0"/>
+        <w:keepLines w:val="0"/>
+        <w:widowControl/>
+        <w:suppressLineNumbers w:val="0"/>
+        <w:rPr>
+          <w:b/>
+          <w:bCs/>
           <w:sz w:val="32"/>
           <w:szCs w:val="32"/>
-        </w:rPr>
-      </w:pPr>
-      <w:r>
-        <w:rPr>
-          <w:b w:val="0"/>
-          <w:bCs w:val="0"/>
+          <w:highlight w:val="yellow"/>
+        </w:rPr>
+      </w:pPr>
+      <w:r>
+        <w:rPr>
+          <w:b/>
+          <w:bCs/>
           <w:sz w:val="32"/>
           <w:szCs w:val="32"/>
-        </w:rPr>
-        <w:t>Java Variables</w:t>
-      </w:r>
-    </w:p>
-    <w:p>
-      <w:pPr>
-        <w:bidi w:val="0"/>
-      </w:pPr>
-      <w:r>
-        <w:t>In Java, there are 5 different types of variables, for example:</w:t>
-      </w:r>
-    </w:p>
-    <w:p>
-      <w:pPr>
-        <w:bidi w:val="0"/>
-      </w:pPr>
-      <w:r>
-        <w:t>String </w:t>
-      </w:r>
-    </w:p>
-    <w:p>
-      <w:pPr>
-        <w:bidi w:val="0"/>
-      </w:pPr>
-      <w:r>
-        <w:t>int -</w:t>
-      </w:r>
-    </w:p>
-    <w:p>
-      <w:pPr>
-        <w:bidi w:val="0"/>
-      </w:pPr>
-      <w:r>
-        <w:t>float - stores floating point numbers, with decimals, such as 19.99 or -19.99  float mynum = 5.99f; double mynum =19.99d;</w:t>
-      </w:r>
-    </w:p>
-    <w:p>
-      <w:pPr>
-        <w:bidi w:val="0"/>
-      </w:pPr>
-      <w:r>
-        <w:t xml:space="preserve">char - </w:t>
-      </w:r>
-    </w:p>
-    <w:p>
-      <w:pPr>
-        <w:bidi w:val="0"/>
-      </w:pPr>
-      <w:r>
-        <w:t xml:space="preserve">boolean - </w:t>
-      </w:r>
-    </w:p>
-    <w:p>
-      <w:pPr>
-        <w:bidi w:val="0"/>
-      </w:pPr>
-    </w:p>
-    <w:p>
-      <w:pPr>
-        <w:bidi w:val="0"/>
-        <w:rPr>
+          <w:highlight w:val="yellow"/>
+        </w:rPr>
+        <w:t xml:space="preserve">Because decimal numbers are treated as </w:t>
+      </w:r>
+      <w:r>
+        <w:rPr>
+          <w:rStyle w:val="10"/>
           <w:b/>
           <w:bCs/>
-          <w:sz w:val="24"/>
-          <w:szCs w:val="24"/>
-          <w:lang w:eastAsia="en-IN"/>
-        </w:rPr>
-      </w:pPr>
+          <w:sz w:val="22"/>
+          <w:szCs w:val="22"/>
+          <w:highlight w:val="yellow"/>
+        </w:rPr>
+        <w:t>double</w:t>
+      </w:r>
       <w:r>
         <w:rPr>
           <w:b/>
           <w:bCs/>
-          <w:sz w:val="24"/>
-          <w:szCs w:val="24"/>
+          <w:sz w:val="32"/>
+          <w:szCs w:val="32"/>
+          <w:highlight w:val="yellow"/>
+        </w:rPr>
+        <w:t xml:space="preserve"> by default.</w:t>
+      </w:r>
+    </w:p>
+    <w:p>
+      <w:pPr>
+        <w:bidi w:val="0"/>
+        <w:rPr>
+          <w:sz w:val="24"/>
+          <w:szCs w:val="24"/>
+          <w:highlight w:val="yellow"/>
+        </w:rPr>
+      </w:pPr>
+    </w:p>
+    <w:p>
+      <w:pPr>
+        <w:bidi w:val="0"/>
+      </w:pPr>
+    </w:p>
+    <w:p>
+      <w:pPr>
+        <w:bidi w:val="0"/>
+        <w:rPr>
+          <w:b/>
+          <w:bCs/>
+          <w:sz w:val="32"/>
+          <w:szCs w:val="32"/>
+          <w:lang w:eastAsia="en-IN"/>
+        </w:rPr>
+      </w:pPr>
+      <w:r>
+        <w:rPr>
+          <w:b/>
+          <w:bCs/>
+          <w:sz w:val="32"/>
+          <w:szCs w:val="32"/>
           <w:lang w:eastAsia="en-IN"/>
         </w:rPr>
         <w:t>Data types are divided into two groups:</w:t>
@@ -8996,11 +9504,15 @@
         </w:numPr>
         <w:bidi w:val="0"/>
         <w:rPr>
+          <w:sz w:val="28"/>
+          <w:szCs w:val="28"/>
           <w:lang w:eastAsia="en-IN"/>
         </w:rPr>
       </w:pPr>
       <w:r>
         <w:rPr>
+          <w:sz w:val="28"/>
+          <w:szCs w:val="28"/>
           <w:lang w:eastAsia="en-IN"/>
         </w:rPr>
         <w:t>Primitive data types - includes byte, short, int, long, float, double, boolean and char</w:t>
@@ -9015,92 +9527,150 @@
         <w:bidi w:val="0"/>
         <w:ind w:left="0" w:leftChars="0" w:firstLine="0" w:firstLineChars="0"/>
         <w:rPr>
+          <w:sz w:val="28"/>
+          <w:szCs w:val="28"/>
           <w:lang w:eastAsia="en-IN"/>
         </w:rPr>
       </w:pPr>
       <w:r>
         <w:rPr>
+          <w:sz w:val="28"/>
+          <w:szCs w:val="28"/>
           <w:lang w:eastAsia="en-IN"/>
         </w:rPr>
         <w:t>Non-primitive data types - such as </w:t>
       </w:r>
       <w:r>
+        <w:rPr>
+          <w:sz w:val="28"/>
+          <w:szCs w:val="28"/>
+        </w:rPr>
         <w:fldChar w:fldCharType="begin"/>
       </w:r>
       <w:r>
+        <w:rPr>
+          <w:sz w:val="28"/>
+          <w:szCs w:val="28"/>
+        </w:rPr>
         <w:instrText xml:space="preserve"> HYPERLINK "https://www.w3schools.com/java/java_strings.asp" </w:instrText>
       </w:r>
       <w:r>
+        <w:rPr>
+          <w:sz w:val="28"/>
+          <w:szCs w:val="28"/>
+        </w:rPr>
         <w:fldChar w:fldCharType="separate"/>
       </w:r>
       <w:r>
         <w:rPr>
+          <w:sz w:val="28"/>
+          <w:szCs w:val="28"/>
           <w:lang w:eastAsia="en-IN"/>
         </w:rPr>
         <w:t>String</w:t>
       </w:r>
       <w:r>
         <w:rPr>
+          <w:sz w:val="28"/>
+          <w:szCs w:val="28"/>
           <w:lang w:eastAsia="en-IN"/>
         </w:rPr>
         <w:fldChar w:fldCharType="end"/>
       </w:r>
       <w:r>
         <w:rPr>
+          <w:sz w:val="28"/>
+          <w:szCs w:val="28"/>
           <w:lang w:eastAsia="en-IN"/>
         </w:rPr>
         <w:t>, </w:t>
       </w:r>
       <w:r>
+        <w:rPr>
+          <w:sz w:val="28"/>
+          <w:szCs w:val="28"/>
+        </w:rPr>
         <w:fldChar w:fldCharType="begin"/>
       </w:r>
       <w:r>
+        <w:rPr>
+          <w:sz w:val="28"/>
+          <w:szCs w:val="28"/>
+        </w:rPr>
         <w:instrText xml:space="preserve"> HYPERLINK "https://www.w3schools.com/java/java_arrays.asp" </w:instrText>
       </w:r>
       <w:r>
+        <w:rPr>
+          <w:sz w:val="28"/>
+          <w:szCs w:val="28"/>
+        </w:rPr>
         <w:fldChar w:fldCharType="separate"/>
       </w:r>
       <w:r>
         <w:rPr>
+          <w:sz w:val="28"/>
+          <w:szCs w:val="28"/>
           <w:lang w:eastAsia="en-IN"/>
         </w:rPr>
         <w:t>Arrays</w:t>
       </w:r>
       <w:r>
         <w:rPr>
+          <w:sz w:val="28"/>
+          <w:szCs w:val="28"/>
           <w:lang w:eastAsia="en-IN"/>
         </w:rPr>
         <w:fldChar w:fldCharType="end"/>
       </w:r>
       <w:r>
         <w:rPr>
+          <w:sz w:val="28"/>
+          <w:szCs w:val="28"/>
           <w:lang w:eastAsia="en-IN"/>
         </w:rPr>
         <w:t> and </w:t>
       </w:r>
       <w:r>
+        <w:rPr>
+          <w:sz w:val="28"/>
+          <w:szCs w:val="28"/>
+        </w:rPr>
         <w:fldChar w:fldCharType="begin"/>
       </w:r>
       <w:r>
+        <w:rPr>
+          <w:sz w:val="28"/>
+          <w:szCs w:val="28"/>
+        </w:rPr>
         <w:instrText xml:space="preserve"> HYPERLINK "https://www.w3schools.com/java/java_classes.asp" </w:instrText>
       </w:r>
       <w:r>
+        <w:rPr>
+          <w:sz w:val="28"/>
+          <w:szCs w:val="28"/>
+        </w:rPr>
         <w:fldChar w:fldCharType="separate"/>
       </w:r>
       <w:r>
         <w:rPr>
+          <w:sz w:val="28"/>
+          <w:szCs w:val="28"/>
           <w:lang w:eastAsia="en-IN"/>
         </w:rPr>
         <w:t>Classes</w:t>
       </w:r>
       <w:r>
         <w:rPr>
+          <w:sz w:val="28"/>
+          <w:szCs w:val="28"/>
           <w:lang w:eastAsia="en-IN"/>
         </w:rPr>
         <w:fldChar w:fldCharType="end"/>
       </w:r>
       <w:r>
         <w:rPr>
+          <w:sz w:val="28"/>
+          <w:szCs w:val="28"/>
           <w:lang w:eastAsia="en-IN"/>
         </w:rPr>
         <w:t> (you will learn more about these in a later chapter)</w:t>
@@ -9108,46 +9678,128 @@
     </w:p>
     <w:p>
       <w:pPr>
+        <w:numPr>
+          <w:ilvl w:val="0"/>
+          <w:numId w:val="0"/>
+        </w:numPr>
         <w:bidi w:val="0"/>
-      </w:pPr>
-      <w:r>
-        <w:t>Non-primitive data types are called reference types because they refer to objects.</w:t>
-      </w:r>
+        <w:ind w:leftChars="0"/>
+        <w:rPr>
+          <w:sz w:val="28"/>
+          <w:szCs w:val="28"/>
+          <w:lang w:eastAsia="en-IN"/>
+        </w:rPr>
+      </w:pPr>
     </w:p>
     <w:p>
       <w:pPr>
         <w:bidi w:val="0"/>
-      </w:pPr>
-      <w:r>
-        <w:t>A primitive data type specifies the size and type of variable values, and it has no additional methods.</w:t>
+        <w:rPr>
+          <w:sz w:val="28"/>
+          <w:szCs w:val="28"/>
+        </w:rPr>
+      </w:pPr>
+      <w:r>
+        <w:rPr>
+          <w:sz w:val="28"/>
+          <w:szCs w:val="28"/>
+        </w:rPr>
+        <w:t>Non-primitive data types are called </w:t>
+      </w:r>
+      <w:r>
+        <w:rPr>
+          <w:sz w:val="28"/>
+          <w:szCs w:val="28"/>
+          <w:highlight w:val="yellow"/>
+        </w:rPr>
+        <w:t>reference types</w:t>
+      </w:r>
+      <w:r>
+        <w:rPr>
+          <w:sz w:val="28"/>
+          <w:szCs w:val="28"/>
+        </w:rPr>
+        <w:t> because they refer to objects.</w:t>
       </w:r>
     </w:p>
     <w:p>
       <w:pPr>
         <w:bidi w:val="0"/>
         <w:rPr>
+          <w:sz w:val="28"/>
+          <w:szCs w:val="28"/>
+          <w:highlight w:val="yellow"/>
+        </w:rPr>
+      </w:pPr>
+      <w:r>
+        <w:rPr>
+          <w:sz w:val="28"/>
+          <w:szCs w:val="28"/>
+        </w:rPr>
+        <w:t>A primitive data type specifies the size and type of variable values, and</w:t>
+      </w:r>
+      <w:r>
+        <w:rPr>
+          <w:sz w:val="28"/>
+          <w:szCs w:val="28"/>
+          <w:highlight w:val="yellow"/>
+        </w:rPr>
+        <w:t xml:space="preserve"> it has no additional methods.</w:t>
+      </w:r>
+    </w:p>
+    <w:p>
+      <w:pPr>
+        <w:bidi w:val="0"/>
+        <w:rPr>
+          <w:sz w:val="28"/>
+          <w:szCs w:val="28"/>
           <w:lang w:eastAsia="en-IN"/>
         </w:rPr>
       </w:pPr>
       <w:r>
         <w:rPr>
+          <w:sz w:val="28"/>
+          <w:szCs w:val="28"/>
           <w:lang w:eastAsia="en-IN"/>
         </w:rPr>
-        <w:t>A primitive type has always a value, while non-primitive types can be null.</w:t>
+        <w:t xml:space="preserve">A primitive type has always a value, while </w:t>
+      </w:r>
+      <w:r>
+        <w:rPr>
+          <w:sz w:val="28"/>
+          <w:szCs w:val="28"/>
+          <w:highlight w:val="yellow"/>
+          <w:lang w:eastAsia="en-IN"/>
+        </w:rPr>
+        <w:t>non-primitive types can be null.</w:t>
       </w:r>
     </w:p>
     <w:p>
       <w:pPr>
         <w:bidi w:val="0"/>
         <w:rPr>
+          <w:sz w:val="28"/>
+          <w:szCs w:val="28"/>
+          <w:highlight w:val="yellow"/>
           <w:lang w:eastAsia="en-IN"/>
         </w:rPr>
       </w:pPr>
       <w:r>
         <w:rPr>
+          <w:sz w:val="28"/>
+          <w:szCs w:val="28"/>
           <w:lang w:eastAsia="en-IN"/>
         </w:rPr>
-        <w:t>A primitive type starts with a lowercase letter, while non-primitive types starts with an uppercase letter.</w:t>
+        <w:t>A primitive type starts with a lowercase letter, while</w:t>
+      </w:r>
+      <w:r>
+        <w:rPr>
+          <w:sz w:val="28"/>
+          <w:szCs w:val="28"/>
+          <w:highlight w:val="yellow"/>
+          <w:lang w:eastAsia="en-IN"/>
+        </w:rPr>
+        <w:t xml:space="preserve"> non-primitive types starts with an uppercase letter.</w:t>
       </w:r>
     </w:p>
     <w:p>
@@ -9163,14 +9815,14 @@
           <w:b w:val="0"/>
           <w:bCs w:val="0"/>
           <w:color w:val="DDDDDD"/>
-          <w:sz w:val="32"/>
-          <w:szCs w:val="48"/>
-        </w:rPr>
-      </w:pPr>
-      <w:r>
-        <w:rPr>
-          <w:sz w:val="32"/>
-          <w:szCs w:val="32"/>
+          <w:sz w:val="36"/>
+          <w:szCs w:val="52"/>
+        </w:rPr>
+      </w:pPr>
+      <w:r>
+        <w:rPr>
+          <w:sz w:val="36"/>
+          <w:szCs w:val="36"/>
         </w:rPr>
         <w:t>Java Type Casting</w:t>
       </w:r>
@@ -9178,17 +9830,47 @@
     <w:p>
       <w:pPr>
         <w:bidi w:val="0"/>
-      </w:pPr>
-      <w:r>
+        <w:rPr>
+          <w:sz w:val="28"/>
+          <w:szCs w:val="28"/>
+        </w:rPr>
+      </w:pPr>
+      <w:r>
+        <w:rPr>
+          <w:sz w:val="28"/>
+          <w:szCs w:val="28"/>
+        </w:rPr>
         <w:t>Type casting is when you assign a value of one primitive data type to another type.</w:t>
       </w:r>
+      <w:r>
+        <w:rPr>
+          <w:sz w:val="28"/>
+          <w:szCs w:val="28"/>
+        </w:rPr>
+        <w:br w:type="textWrapping"/>
+      </w:r>
     </w:p>
     <w:p>
       <w:pPr>
         <w:bidi w:val="0"/>
-      </w:pPr>
-      <w:r>
+        <w:rPr>
+          <w:sz w:val="28"/>
+          <w:szCs w:val="28"/>
+        </w:rPr>
+      </w:pPr>
+      <w:r>
+        <w:rPr>
+          <w:sz w:val="28"/>
+          <w:szCs w:val="28"/>
+        </w:rPr>
         <w:t>In Java, there are two types of casting:</w:t>
+      </w:r>
+      <w:r>
+        <w:rPr>
+          <w:sz w:val="28"/>
+          <w:szCs w:val="28"/>
+        </w:rPr>
+        <w:br w:type="textWrapping"/>
       </w:r>
     </w:p>
     <w:p>
@@ -9198,24 +9880,65 @@
           <w:numId w:val="6"/>
         </w:numPr>
         <w:bidi w:val="0"/>
-      </w:pPr>
+        <w:rPr>
+          <w:sz w:val="24"/>
+          <w:szCs w:val="24"/>
+        </w:rPr>
+      </w:pPr>
+      <w:r>
+        <w:rPr>
+          <w:sz w:val="32"/>
+          <w:szCs w:val="32"/>
+        </w:rPr>
+        <w:t>Widening Casting (automatically)</w:t>
+      </w:r>
       <w:r>
         <w:rPr>
           <w:sz w:val="28"/>
           <w:szCs w:val="28"/>
         </w:rPr>
-        <w:t>Widening Casting (automatically)</w:t>
-      </w:r>
-      <w:r>
-        <w:t xml:space="preserve"> - converting a smaller type to a larger type size</w:t>
-      </w:r>
-      <w:r>
+        <w:t xml:space="preserve"> - </w:t>
+      </w:r>
+      <w:r>
+        <w:rPr>
+          <w:sz w:val="28"/>
+          <w:szCs w:val="28"/>
+        </w:rPr>
         <w:br w:type="textWrapping"/>
       </w:r>
       <w:r>
+        <w:rPr>
+          <w:sz w:val="28"/>
+          <w:szCs w:val="28"/>
+        </w:rPr>
+        <w:t>converting a smaller type to a larger type size</w:t>
+      </w:r>
+      <w:r>
+        <w:rPr>
+          <w:sz w:val="28"/>
+          <w:szCs w:val="28"/>
+        </w:rPr>
+        <w:br w:type="textWrapping"/>
+      </w:r>
+      <w:r>
+        <w:rPr>
+          <w:sz w:val="28"/>
+          <w:szCs w:val="28"/>
+        </w:rPr>
+        <w:br w:type="textWrapping"/>
+      </w:r>
+      <w:r>
+        <w:rPr>
+          <w:sz w:val="28"/>
+          <w:szCs w:val="28"/>
+        </w:rPr>
         <w:t>byte -&gt; short -&gt; char -&gt; int -&gt; long -&gt; float -&gt; double</w:t>
       </w:r>
       <w:r>
+        <w:rPr>
+          <w:sz w:val="24"/>
+          <w:szCs w:val="24"/>
+        </w:rPr>
         <w:br w:type="textWrapping"/>
       </w:r>
     </w:p>
@@ -9227,30 +9950,73 @@
         </w:numPr>
         <w:bidi w:val="0"/>
         <w:ind w:left="0" w:leftChars="0" w:firstLine="0" w:firstLineChars="0"/>
-      </w:pPr>
-      <w:r>
         <w:rPr>
           <w:sz w:val="28"/>
           <w:szCs w:val="28"/>
         </w:rPr>
+      </w:pPr>
+      <w:r>
+        <w:rPr>
+          <w:sz w:val="32"/>
+          <w:szCs w:val="32"/>
+        </w:rPr>
         <w:t xml:space="preserve">Narrowing Casting (manually) </w:t>
       </w:r>
       <w:r>
-        <w:t>- converting a larger type to a smaller size type</w:t>
-      </w:r>
-      <w:r>
+        <w:rPr>
+          <w:sz w:val="28"/>
+          <w:szCs w:val="28"/>
+        </w:rPr>
+        <w:t xml:space="preserve">- </w:t>
+      </w:r>
+      <w:r>
+        <w:rPr>
+          <w:sz w:val="28"/>
+          <w:szCs w:val="28"/>
+        </w:rPr>
         <w:br w:type="textWrapping"/>
       </w:r>
       <w:r>
+        <w:rPr>
+          <w:sz w:val="28"/>
+          <w:szCs w:val="28"/>
+        </w:rPr>
+        <w:t>converting a larger type to a smaller size type</w:t>
+      </w:r>
+      <w:r>
+        <w:rPr>
+          <w:sz w:val="28"/>
+          <w:szCs w:val="28"/>
+        </w:rPr>
+        <w:br w:type="textWrapping"/>
+      </w:r>
+      <w:r>
+        <w:rPr>
+          <w:sz w:val="28"/>
+          <w:szCs w:val="28"/>
+        </w:rPr>
+        <w:br w:type="textWrapping"/>
+      </w:r>
+      <w:r>
+        <w:rPr>
+          <w:sz w:val="28"/>
+          <w:szCs w:val="28"/>
+        </w:rPr>
         <w:t>double -&gt; float -&gt; long -&gt; int -&gt; char -&gt; short -&gt; byte</w:t>
       </w:r>
     </w:p>
     <w:p>
       <w:pPr>
         <w:bidi w:val="0"/>
-      </w:pPr>
-      <w:r>
-        <w:rPr>
+        <w:rPr>
+          <w:sz w:val="28"/>
+          <w:szCs w:val="28"/>
+        </w:rPr>
+      </w:pPr>
+      <w:r>
+        <w:rPr>
+          <w:sz w:val="28"/>
+          <w:szCs w:val="28"/>
           <w:lang w:eastAsia="en-IN"/>
         </w:rPr>
         <w:t>int myInt = (int) myDouble; // Manual casting: double to int</w:t>
@@ -9712,14 +10478,16 @@
         <w:bidi w:val="0"/>
         <w:rPr>
           <w:rFonts w:hint="default"/>
+          <w:sz w:val="28"/>
+          <w:szCs w:val="28"/>
           <w:lang w:val="en-US"/>
         </w:rPr>
       </w:pPr>
-      <w:bookmarkStart w:id="0" w:name="_GoBack"/>
-      <w:bookmarkEnd w:id="0"/>
       <w:r>
         <w:rPr>
           <w:rFonts w:hint="default"/>
+          <w:sz w:val="28"/>
+          <w:szCs w:val="28"/>
           <w:lang w:val="en-US"/>
         </w:rPr>
         <w:t>% -&gt; modules operator , gives reminder when divided.</w:t>
@@ -9744,669 +10512,372 @@
           <w:rFonts w:hint="default" w:ascii="Times New Roman" w:hAnsi="Times New Roman" w:cs="Times New Roman"/>
           <w:b/>
           <w:bCs/>
+          <w:sz w:val="32"/>
+          <w:szCs w:val="32"/>
+        </w:rPr>
+      </w:pPr>
+      <w:r>
+        <w:rPr>
+          <w:rFonts w:hint="default" w:ascii="Times New Roman" w:hAnsi="Times New Roman" w:cs="Times New Roman"/>
+          <w:b/>
+          <w:bCs/>
+          <w:sz w:val="32"/>
+          <w:szCs w:val="32"/>
+        </w:rPr>
+        <w:t>ternary operator</w:t>
+      </w:r>
+    </w:p>
+    <w:p>
+      <w:pPr>
+        <w:pStyle w:val="19"/>
+        <w:ind w:left="0" w:leftChars="0" w:firstLine="0" w:firstLineChars="0"/>
+        <w:rPr>
+          <w:rStyle w:val="14"/>
+          <w:rFonts w:ascii="Verdana" w:hAnsi="Verdana"/>
+          <w:color w:val="DDDDDD"/>
+          <w:sz w:val="24"/>
+          <w:szCs w:val="24"/>
+          <w:shd w:val="clear" w:color="auto" w:fill="1D2A35"/>
+        </w:rPr>
+      </w:pPr>
+    </w:p>
+    <w:p>
+      <w:pPr>
+        <w:pStyle w:val="19"/>
+        <w:ind w:left="0" w:leftChars="0" w:firstLine="0" w:firstLineChars="0"/>
+        <w:rPr>
+          <w:rStyle w:val="17"/>
+          <w:rFonts w:ascii="Consolas" w:hAnsi="Consolas"/>
+          <w:i/>
+          <w:iCs/>
+          <w:sz w:val="24"/>
+          <w:szCs w:val="24"/>
+        </w:rPr>
+      </w:pPr>
+      <w:r>
+        <w:rPr>
+          <w:rStyle w:val="7"/>
+          <w:rFonts w:ascii="Consolas" w:hAnsi="Consolas"/>
+          <w:sz w:val="24"/>
+          <w:szCs w:val="24"/>
+        </w:rPr>
+        <w:t>variable</w:t>
+      </w:r>
+      <w:r>
+        <w:rPr>
+          <w:rStyle w:val="10"/>
+          <w:rFonts w:ascii="Consolas" w:hAnsi="Consolas"/>
+          <w:i/>
+          <w:iCs/>
+          <w:sz w:val="24"/>
+          <w:szCs w:val="24"/>
+        </w:rPr>
+        <w:t xml:space="preserve"> </w:t>
+      </w:r>
+      <w:r>
+        <w:rPr>
+          <w:rStyle w:val="17"/>
+          <w:rFonts w:ascii="Consolas" w:hAnsi="Consolas"/>
+          <w:i/>
+          <w:iCs/>
+          <w:sz w:val="24"/>
+          <w:szCs w:val="24"/>
+        </w:rPr>
+        <w:t>=</w:t>
+      </w:r>
+      <w:r>
+        <w:rPr>
+          <w:rStyle w:val="10"/>
+          <w:rFonts w:ascii="Consolas" w:hAnsi="Consolas"/>
+          <w:i/>
+          <w:iCs/>
+          <w:sz w:val="24"/>
+          <w:szCs w:val="24"/>
+        </w:rPr>
+        <w:t xml:space="preserve"> </w:t>
+      </w:r>
+      <w:r>
+        <w:rPr>
+          <w:rStyle w:val="17"/>
+          <w:rFonts w:ascii="Consolas" w:hAnsi="Consolas"/>
+          <w:i/>
+          <w:iCs/>
+          <w:sz w:val="24"/>
+          <w:szCs w:val="24"/>
+        </w:rPr>
+        <w:t>(</w:t>
+      </w:r>
+      <w:r>
+        <w:rPr>
+          <w:rStyle w:val="7"/>
+          <w:rFonts w:ascii="Consolas" w:hAnsi="Consolas"/>
+          <w:sz w:val="24"/>
+          <w:szCs w:val="24"/>
+        </w:rPr>
+        <w:t>condition</w:t>
+      </w:r>
+      <w:r>
+        <w:rPr>
+          <w:rStyle w:val="17"/>
+          <w:rFonts w:ascii="Consolas" w:hAnsi="Consolas"/>
+          <w:i/>
+          <w:iCs/>
+          <w:sz w:val="24"/>
+          <w:szCs w:val="24"/>
+        </w:rPr>
+        <w:t>)</w:t>
+      </w:r>
+      <w:r>
+        <w:rPr>
+          <w:rStyle w:val="10"/>
+          <w:rFonts w:ascii="Consolas" w:hAnsi="Consolas"/>
+          <w:i/>
+          <w:iCs/>
+          <w:sz w:val="24"/>
+          <w:szCs w:val="24"/>
+        </w:rPr>
+        <w:t xml:space="preserve"> </w:t>
+      </w:r>
+      <w:r>
+        <w:rPr>
+          <w:rStyle w:val="17"/>
+          <w:rFonts w:ascii="Consolas" w:hAnsi="Consolas"/>
+          <w:i/>
+          <w:iCs/>
+          <w:sz w:val="24"/>
+          <w:szCs w:val="24"/>
+        </w:rPr>
+        <w:t>?</w:t>
+      </w:r>
+      <w:r>
+        <w:rPr>
+          <w:rStyle w:val="10"/>
+          <w:rFonts w:ascii="Consolas" w:hAnsi="Consolas"/>
+          <w:i/>
+          <w:iCs/>
+          <w:sz w:val="24"/>
+          <w:szCs w:val="24"/>
+        </w:rPr>
+        <w:t xml:space="preserve"> </w:t>
+      </w:r>
+      <w:r>
+        <w:rPr>
+          <w:rStyle w:val="7"/>
+          <w:rFonts w:ascii="Consolas" w:hAnsi="Consolas"/>
+          <w:sz w:val="24"/>
+          <w:szCs w:val="24"/>
+        </w:rPr>
+        <w:t>expressionTrue</w:t>
+      </w:r>
+      <w:r>
+        <w:rPr>
+          <w:rStyle w:val="10"/>
+          <w:rFonts w:ascii="Consolas" w:hAnsi="Consolas"/>
+          <w:i/>
+          <w:iCs/>
+          <w:sz w:val="24"/>
+          <w:szCs w:val="24"/>
+        </w:rPr>
+        <w:t xml:space="preserve"> </w:t>
+      </w:r>
+      <w:r>
+        <w:rPr>
+          <w:rStyle w:val="17"/>
+          <w:rFonts w:ascii="Consolas" w:hAnsi="Consolas"/>
+          <w:i/>
+          <w:iCs/>
+          <w:sz w:val="24"/>
+          <w:szCs w:val="24"/>
+        </w:rPr>
+        <w:t>:</w:t>
+      </w:r>
+      <w:r>
+        <w:rPr>
+          <w:rStyle w:val="10"/>
+          <w:rFonts w:ascii="Consolas" w:hAnsi="Consolas"/>
+          <w:i/>
+          <w:iCs/>
+          <w:sz w:val="24"/>
+          <w:szCs w:val="24"/>
+        </w:rPr>
+        <w:t xml:space="preserve"> </w:t>
+      </w:r>
+      <w:r>
+        <w:rPr>
+          <w:rStyle w:val="7"/>
+          <w:rFonts w:ascii="Consolas" w:hAnsi="Consolas"/>
+          <w:sz w:val="24"/>
+          <w:szCs w:val="24"/>
+        </w:rPr>
+        <w:t xml:space="preserve"> expressionFalse</w:t>
+      </w:r>
+      <w:r>
+        <w:rPr>
+          <w:rStyle w:val="17"/>
+          <w:rFonts w:ascii="Consolas" w:hAnsi="Consolas"/>
+          <w:i/>
+          <w:iCs/>
+          <w:sz w:val="24"/>
+          <w:szCs w:val="24"/>
+        </w:rPr>
+        <w:t>;</w:t>
+      </w:r>
+    </w:p>
+    <w:p>
+      <w:pPr>
+        <w:bidi w:val="0"/>
+      </w:pPr>
+    </w:p>
+    <w:p>
+      <w:pPr>
+        <w:bidi w:val="0"/>
+        <w:rPr>
+          <w:rFonts w:hint="default" w:ascii="Times New Roman" w:hAnsi="Times New Roman" w:cs="Times New Roman"/>
+          <w:b/>
+          <w:bCs/>
+          <w:sz w:val="32"/>
+          <w:szCs w:val="32"/>
+        </w:rPr>
+      </w:pPr>
+      <w:r>
+        <w:rPr>
+          <w:rFonts w:hint="default" w:ascii="Times New Roman" w:hAnsi="Times New Roman" w:cs="Times New Roman"/>
+          <w:b/>
+          <w:bCs/>
+          <w:sz w:val="32"/>
+          <w:szCs w:val="32"/>
+        </w:rPr>
+        <w:t>For-Each Loop</w:t>
+      </w:r>
+      <w:r>
+        <w:rPr>
+          <w:rFonts w:hint="default" w:ascii="Times New Roman" w:hAnsi="Times New Roman" w:cs="Times New Roman"/>
+          <w:b/>
+          <w:bCs/>
+          <w:sz w:val="32"/>
+          <w:szCs w:val="32"/>
+        </w:rPr>
+        <w:br w:type="textWrapping"/>
+      </w:r>
+    </w:p>
+    <w:p>
+      <w:pPr>
+        <w:bidi w:val="0"/>
+        <w:rPr>
           <w:sz w:val="28"/>
           <w:szCs w:val="28"/>
-        </w:rPr>
-      </w:pPr>
-      <w:r>
-        <w:rPr>
-          <w:rFonts w:hint="default" w:ascii="Times New Roman" w:hAnsi="Times New Roman" w:cs="Times New Roman"/>
+          <w:highlight w:val="yellow"/>
+        </w:rPr>
+      </w:pPr>
+      <w:r>
+        <w:rPr>
+          <w:sz w:val="28"/>
+          <w:szCs w:val="28"/>
+          <w:highlight w:val="yellow"/>
+        </w:rPr>
+        <w:t>String[] cars = {"Volvo", "BMW", "Ford", "Mazda"};</w:t>
+      </w:r>
+    </w:p>
+    <w:p>
+      <w:pPr>
+        <w:bidi w:val="0"/>
+        <w:rPr>
+          <w:sz w:val="28"/>
+          <w:szCs w:val="28"/>
+          <w:highlight w:val="yellow"/>
+        </w:rPr>
+      </w:pPr>
+      <w:r>
+        <w:rPr>
+          <w:sz w:val="28"/>
+          <w:szCs w:val="28"/>
+          <w:highlight w:val="yellow"/>
+        </w:rPr>
+        <w:t>for (String i : cars) {</w:t>
+      </w:r>
+    </w:p>
+    <w:p>
+      <w:pPr>
+        <w:bidi w:val="0"/>
+        <w:rPr>
+          <w:sz w:val="28"/>
+          <w:szCs w:val="28"/>
+          <w:highlight w:val="yellow"/>
+        </w:rPr>
+      </w:pPr>
+      <w:r>
+        <w:rPr>
+          <w:sz w:val="28"/>
+          <w:szCs w:val="28"/>
+          <w:highlight w:val="yellow"/>
+        </w:rPr>
+        <w:t xml:space="preserve">  System.out.println(i);</w:t>
+      </w:r>
+    </w:p>
+    <w:p>
+      <w:pPr>
+        <w:bidi w:val="0"/>
+        <w:rPr>
+          <w:rFonts w:hint="default"/>
+          <w:sz w:val="28"/>
+          <w:szCs w:val="28"/>
+          <w:highlight w:val="yellow"/>
+          <w:lang w:val="en-US"/>
+        </w:rPr>
+      </w:pPr>
+      <w:r>
+        <w:rPr>
+          <w:sz w:val="28"/>
+          <w:szCs w:val="28"/>
+          <w:highlight w:val="yellow"/>
+        </w:rPr>
+        <w:t>}</w:t>
+      </w:r>
+      <w:r>
+        <w:rPr>
+          <w:rFonts w:hint="default"/>
+          <w:sz w:val="28"/>
+          <w:szCs w:val="28"/>
+          <w:highlight w:val="yellow"/>
+          <w:lang w:val="en-US"/>
+        </w:rPr>
+        <w:t xml:space="preserve"> </w:t>
+      </w:r>
+      <w:r>
+        <w:rPr>
+          <w:rFonts w:hint="default"/>
+          <w:sz w:val="28"/>
+          <w:szCs w:val="28"/>
+          <w:highlight w:val="yellow"/>
+          <w:lang w:val="en-US"/>
+        </w:rPr>
+        <w:br w:type="textWrapping"/>
+      </w:r>
+    </w:p>
+    <w:p>
+      <w:pPr>
+        <w:bidi w:val="0"/>
+        <w:rPr>
+          <w:rFonts w:hint="default"/>
           <w:b/>
           <w:bCs/>
           <w:sz w:val="28"/>
           <w:szCs w:val="28"/>
-        </w:rPr>
-        <w:t>ternary operator</w:t>
-      </w:r>
-    </w:p>
-    <w:p>
-      <w:pPr>
-        <w:pStyle w:val="19"/>
-        <w:ind w:left="0" w:leftChars="0" w:firstLine="0" w:firstLineChars="0"/>
-        <w:rPr>
-          <w:rStyle w:val="14"/>
-          <w:rFonts w:ascii="Verdana" w:hAnsi="Verdana"/>
-          <w:color w:val="DDDDDD"/>
-          <w:sz w:val="23"/>
-          <w:szCs w:val="23"/>
-          <w:shd w:val="clear" w:color="auto" w:fill="1D2A35"/>
-        </w:rPr>
-      </w:pPr>
-    </w:p>
-    <w:p>
-      <w:pPr>
-        <w:pStyle w:val="19"/>
-        <w:ind w:left="0" w:leftChars="0" w:firstLine="0" w:firstLineChars="0"/>
-        <w:rPr>
-          <w:rStyle w:val="17"/>
-          <w:rFonts w:ascii="Consolas" w:hAnsi="Consolas"/>
-          <w:i/>
-          <w:iCs/>
-          <w:sz w:val="23"/>
-          <w:szCs w:val="23"/>
-        </w:rPr>
-      </w:pPr>
-      <w:r>
-        <w:rPr>
-          <w:rStyle w:val="7"/>
-          <w:rFonts w:ascii="Consolas" w:hAnsi="Consolas"/>
-          <w:sz w:val="23"/>
-          <w:szCs w:val="23"/>
-        </w:rPr>
-        <w:t>variable</w:t>
-      </w:r>
-      <w:r>
-        <w:rPr>
-          <w:rStyle w:val="10"/>
-          <w:rFonts w:ascii="Consolas" w:hAnsi="Consolas"/>
-          <w:i/>
-          <w:iCs/>
-          <w:sz w:val="23"/>
-          <w:szCs w:val="23"/>
-        </w:rPr>
-        <w:t xml:space="preserve"> </w:t>
-      </w:r>
-      <w:r>
-        <w:rPr>
-          <w:rStyle w:val="17"/>
-          <w:rFonts w:ascii="Consolas" w:hAnsi="Consolas"/>
-          <w:i/>
-          <w:iCs/>
-          <w:sz w:val="23"/>
-          <w:szCs w:val="23"/>
-        </w:rPr>
-        <w:t>=</w:t>
-      </w:r>
-      <w:r>
-        <w:rPr>
-          <w:rStyle w:val="10"/>
-          <w:rFonts w:ascii="Consolas" w:hAnsi="Consolas"/>
-          <w:i/>
-          <w:iCs/>
-          <w:sz w:val="23"/>
-          <w:szCs w:val="23"/>
-        </w:rPr>
-        <w:t xml:space="preserve"> </w:t>
-      </w:r>
-      <w:r>
-        <w:rPr>
-          <w:rStyle w:val="17"/>
-          <w:rFonts w:ascii="Consolas" w:hAnsi="Consolas"/>
-          <w:i/>
-          <w:iCs/>
-          <w:sz w:val="23"/>
-          <w:szCs w:val="23"/>
-        </w:rPr>
-        <w:t>(</w:t>
-      </w:r>
-      <w:r>
-        <w:rPr>
-          <w:rStyle w:val="7"/>
-          <w:rFonts w:ascii="Consolas" w:hAnsi="Consolas"/>
-          <w:sz w:val="23"/>
-          <w:szCs w:val="23"/>
-        </w:rPr>
-        <w:t>condition</w:t>
-      </w:r>
-      <w:r>
-        <w:rPr>
-          <w:rStyle w:val="17"/>
-          <w:rFonts w:ascii="Consolas" w:hAnsi="Consolas"/>
-          <w:i/>
-          <w:iCs/>
-          <w:sz w:val="23"/>
-          <w:szCs w:val="23"/>
-        </w:rPr>
-        <w:t>)</w:t>
-      </w:r>
-      <w:r>
-        <w:rPr>
-          <w:rStyle w:val="10"/>
-          <w:rFonts w:ascii="Consolas" w:hAnsi="Consolas"/>
-          <w:i/>
-          <w:iCs/>
-          <w:sz w:val="23"/>
-          <w:szCs w:val="23"/>
-        </w:rPr>
-        <w:t xml:space="preserve"> </w:t>
-      </w:r>
-      <w:r>
-        <w:rPr>
-          <w:rStyle w:val="17"/>
-          <w:rFonts w:ascii="Consolas" w:hAnsi="Consolas"/>
-          <w:i/>
-          <w:iCs/>
-          <w:sz w:val="23"/>
-          <w:szCs w:val="23"/>
-        </w:rPr>
-        <w:t>?</w:t>
-      </w:r>
-      <w:r>
-        <w:rPr>
-          <w:rStyle w:val="10"/>
-          <w:rFonts w:ascii="Consolas" w:hAnsi="Consolas"/>
-          <w:i/>
-          <w:iCs/>
-          <w:sz w:val="23"/>
-          <w:szCs w:val="23"/>
-        </w:rPr>
-        <w:t xml:space="preserve"> </w:t>
-      </w:r>
-      <w:r>
-        <w:rPr>
-          <w:rStyle w:val="7"/>
-          <w:rFonts w:ascii="Consolas" w:hAnsi="Consolas"/>
-          <w:sz w:val="23"/>
-          <w:szCs w:val="23"/>
-        </w:rPr>
-        <w:t>expressionTrue</w:t>
-      </w:r>
-      <w:r>
-        <w:rPr>
-          <w:rStyle w:val="10"/>
-          <w:rFonts w:ascii="Consolas" w:hAnsi="Consolas"/>
-          <w:i/>
-          <w:iCs/>
-          <w:sz w:val="23"/>
-          <w:szCs w:val="23"/>
-        </w:rPr>
-        <w:t xml:space="preserve"> </w:t>
-      </w:r>
-      <w:r>
-        <w:rPr>
-          <w:rStyle w:val="17"/>
-          <w:rFonts w:ascii="Consolas" w:hAnsi="Consolas"/>
-          <w:i/>
-          <w:iCs/>
-          <w:sz w:val="23"/>
-          <w:szCs w:val="23"/>
-        </w:rPr>
-        <w:t>:</w:t>
-      </w:r>
-      <w:r>
-        <w:rPr>
-          <w:rStyle w:val="10"/>
-          <w:rFonts w:ascii="Consolas" w:hAnsi="Consolas"/>
-          <w:i/>
-          <w:iCs/>
-          <w:sz w:val="23"/>
-          <w:szCs w:val="23"/>
-        </w:rPr>
-        <w:t xml:space="preserve"> </w:t>
-      </w:r>
-      <w:r>
-        <w:rPr>
-          <w:rStyle w:val="7"/>
-          <w:rFonts w:ascii="Consolas" w:hAnsi="Consolas"/>
-          <w:sz w:val="23"/>
-          <w:szCs w:val="23"/>
-        </w:rPr>
-        <w:t xml:space="preserve"> expressionFalse</w:t>
-      </w:r>
-      <w:r>
-        <w:rPr>
-          <w:rStyle w:val="17"/>
-          <w:rFonts w:ascii="Consolas" w:hAnsi="Consolas"/>
-          <w:i/>
-          <w:iCs/>
-          <w:sz w:val="23"/>
-          <w:szCs w:val="23"/>
-        </w:rPr>
-        <w:t>;</w:t>
-      </w:r>
-    </w:p>
-    <w:p>
-      <w:pPr>
-        <w:bidi w:val="0"/>
-      </w:pPr>
-    </w:p>
-    <w:p>
-      <w:pPr>
-        <w:bidi w:val="0"/>
-      </w:pPr>
-    </w:p>
-    <w:p>
-      <w:pPr>
-        <w:bidi w:val="0"/>
-        <w:rPr>
-          <w:rFonts w:hint="default" w:ascii="Times New Roman" w:hAnsi="Times New Roman" w:cs="Times New Roman"/>
+          <w:lang w:val="en-US"/>
+        </w:rPr>
+      </w:pPr>
+      <w:r>
+        <w:rPr>
+          <w:rFonts w:hint="default"/>
           <w:b/>
           <w:bCs/>
           <w:sz w:val="28"/>
           <w:szCs w:val="28"/>
-        </w:rPr>
-      </w:pPr>
-      <w:r>
-        <w:rPr>
-          <w:rFonts w:hint="default" w:ascii="Times New Roman" w:hAnsi="Times New Roman" w:cs="Times New Roman"/>
-          <w:b/>
-          <w:bCs/>
-          <w:sz w:val="28"/>
-          <w:szCs w:val="28"/>
-        </w:rPr>
-        <w:t>For-Each Loop</w:t>
-      </w:r>
-    </w:p>
-    <w:p>
-      <w:pPr>
-        <w:bidi w:val="0"/>
-        <w:rPr>
-          <w:highlight w:val="yellow"/>
-        </w:rPr>
-      </w:pPr>
-      <w:r>
-        <w:rPr>
-          <w:highlight w:val="yellow"/>
-        </w:rPr>
-        <w:t>String[] cars = {"Volvo", "BMW", "Ford", "Mazda"};</w:t>
-      </w:r>
-    </w:p>
-    <w:p>
-      <w:pPr>
-        <w:bidi w:val="0"/>
-        <w:rPr>
-          <w:highlight w:val="yellow"/>
-        </w:rPr>
-      </w:pPr>
-      <w:r>
-        <w:rPr>
-          <w:highlight w:val="yellow"/>
-        </w:rPr>
-        <w:t>for (String i : cars) {</w:t>
-      </w:r>
-    </w:p>
-    <w:p>
-      <w:pPr>
-        <w:bidi w:val="0"/>
-        <w:rPr>
-          <w:highlight w:val="yellow"/>
-        </w:rPr>
-      </w:pPr>
-      <w:r>
-        <w:rPr>
-          <w:highlight w:val="yellow"/>
-        </w:rPr>
-        <w:t xml:space="preserve">  System.out.println(i);</w:t>
-      </w:r>
-    </w:p>
-    <w:p>
-      <w:pPr>
-        <w:bidi w:val="0"/>
-        <w:rPr>
-          <w:rFonts w:hint="default"/>
           <w:lang w:val="en-US"/>
         </w:rPr>
-      </w:pPr>
-      <w:r>
-        <w:rPr>
-          <w:highlight w:val="yellow"/>
-        </w:rPr>
-        <w:t>}</w:t>
-      </w:r>
-      <w:r>
-        <w:rPr>
-          <w:rFonts w:hint="default"/>
-          <w:highlight w:val="yellow"/>
-          <w:lang w:val="en-US"/>
-        </w:rPr>
-        <w:t xml:space="preserve"> </w:t>
-      </w:r>
-      <w:r>
-        <w:rPr>
-          <w:rFonts w:hint="default"/>
-          <w:lang w:val="en-US"/>
-        </w:rPr>
         <w:t>//use forEach loop to access and read data , use normal for loop for any operation on data inside loop.</w:t>
       </w:r>
     </w:p>
-    <w:p>
-      <w:pPr>
-        <w:rPr>
-          <w:sz w:val="28"/>
-          <w:szCs w:val="28"/>
-        </w:rPr>
-      </w:pPr>
-    </w:p>
-    <w:tbl>
-      <w:tblPr>
-        <w:tblStyle w:val="6"/>
-        <w:tblW w:w="0" w:type="auto"/>
-        <w:tblCellSpacing w:w="15" w:type="dxa"/>
-        <w:tblInd w:w="0" w:type="dxa"/>
-        <w:tblBorders>
-          <w:top w:val="none" w:color="auto" w:sz="0" w:space="0"/>
-          <w:left w:val="none" w:color="auto" w:sz="0" w:space="0"/>
-          <w:bottom w:val="none" w:color="auto" w:sz="0" w:space="0"/>
-          <w:right w:val="none" w:color="auto" w:sz="0" w:space="0"/>
-          <w:insideH w:val="none" w:color="auto" w:sz="0" w:space="0"/>
-          <w:insideV w:val="none" w:color="auto" w:sz="0" w:space="0"/>
-        </w:tblBorders>
-        <w:shd w:val="clear" w:color="auto" w:fill="auto"/>
-        <w:tblLayout w:type="autofit"/>
-        <w:tblCellMar>
-          <w:top w:w="15" w:type="dxa"/>
-          <w:left w:w="15" w:type="dxa"/>
-          <w:bottom w:w="15" w:type="dxa"/>
-          <w:right w:w="15" w:type="dxa"/>
-        </w:tblCellMar>
-      </w:tblPr>
-      <w:tblGrid>
-        <w:gridCol w:w="2355"/>
-        <w:gridCol w:w="1408"/>
-      </w:tblGrid>
-      <w:tr>
-        <w:tblPrEx>
-          <w:tblBorders>
-            <w:top w:val="none" w:color="auto" w:sz="0" w:space="0"/>
-            <w:left w:val="none" w:color="auto" w:sz="0" w:space="0"/>
-            <w:bottom w:val="none" w:color="auto" w:sz="0" w:space="0"/>
-            <w:right w:val="none" w:color="auto" w:sz="0" w:space="0"/>
-            <w:insideH w:val="none" w:color="auto" w:sz="0" w:space="0"/>
-            <w:insideV w:val="none" w:color="auto" w:sz="0" w:space="0"/>
-          </w:tblBorders>
-          <w:shd w:val="clear" w:color="auto" w:fill="auto"/>
-          <w:tblCellMar>
-            <w:top w:w="15" w:type="dxa"/>
-            <w:left w:w="15" w:type="dxa"/>
-            <w:bottom w:w="15" w:type="dxa"/>
-            <w:right w:w="15" w:type="dxa"/>
-          </w:tblCellMar>
-        </w:tblPrEx>
-        <w:trPr>
-          <w:trHeight w:val="392" w:hRule="atLeast"/>
-          <w:tblHeader/>
-          <w:tblCellSpacing w:w="15" w:type="dxa"/>
-        </w:trPr>
-        <w:tc>
-          <w:tcPr>
-            <w:tcW w:w="0" w:type="auto"/>
-            <w:shd w:val="clear" w:color="auto" w:fill="auto"/>
-            <w:vAlign w:val="center"/>
-          </w:tcPr>
-          <w:p>
-            <w:pPr>
-              <w:keepNext w:val="0"/>
-              <w:keepLines w:val="0"/>
-              <w:widowControl/>
-              <w:suppressLineNumbers w:val="0"/>
-              <w:jc w:val="center"/>
-              <w:rPr>
-                <w:b/>
-                <w:bCs/>
-              </w:rPr>
-            </w:pPr>
-            <w:r>
-              <w:rPr>
-                <w:rFonts w:ascii="SimSun" w:hAnsi="SimSun" w:eastAsia="SimSun" w:cs="SimSun"/>
-                <w:b/>
-                <w:bCs/>
-                <w:kern w:val="0"/>
-                <w:sz w:val="24"/>
-                <w:szCs w:val="24"/>
-                <w:lang w:val="en-US" w:eastAsia="zh-CN" w:bidi="ar"/>
-              </w:rPr>
-              <w:t>for-loop</w:t>
-            </w:r>
-          </w:p>
-        </w:tc>
-        <w:tc>
-          <w:tcPr>
-            <w:tcW w:w="1363" w:type="dxa"/>
-            <w:shd w:val="clear" w:color="auto" w:fill="auto"/>
-            <w:vAlign w:val="center"/>
-          </w:tcPr>
-          <w:p>
-            <w:pPr>
-              <w:keepNext w:val="0"/>
-              <w:keepLines w:val="0"/>
-              <w:widowControl/>
-              <w:suppressLineNumbers w:val="0"/>
-              <w:jc w:val="center"/>
-              <w:rPr>
-                <w:b/>
-                <w:bCs/>
-              </w:rPr>
-            </w:pPr>
-            <w:r>
-              <w:rPr>
-                <w:rFonts w:ascii="SimSun" w:hAnsi="SimSun" w:eastAsia="SimSun" w:cs="SimSun"/>
-                <w:b/>
-                <w:bCs/>
-                <w:kern w:val="0"/>
-                <w:sz w:val="24"/>
-                <w:szCs w:val="24"/>
-                <w:lang w:val="en-US" w:eastAsia="zh-CN" w:bidi="ar"/>
-              </w:rPr>
-              <w:t>for-each</w:t>
-            </w:r>
-          </w:p>
-        </w:tc>
-      </w:tr>
-      <w:tr>
-        <w:tblPrEx>
-          <w:tblBorders>
-            <w:top w:val="none" w:color="auto" w:sz="0" w:space="0"/>
-            <w:left w:val="none" w:color="auto" w:sz="0" w:space="0"/>
-            <w:bottom w:val="none" w:color="auto" w:sz="0" w:space="0"/>
-            <w:right w:val="none" w:color="auto" w:sz="0" w:space="0"/>
-            <w:insideH w:val="none" w:color="auto" w:sz="0" w:space="0"/>
-            <w:insideV w:val="none" w:color="auto" w:sz="0" w:space="0"/>
-          </w:tblBorders>
-          <w:tblCellMar>
-            <w:top w:w="15" w:type="dxa"/>
-            <w:left w:w="15" w:type="dxa"/>
-            <w:bottom w:w="15" w:type="dxa"/>
-            <w:right w:w="15" w:type="dxa"/>
-          </w:tblCellMar>
-        </w:tblPrEx>
-        <w:trPr>
-          <w:trHeight w:val="382" w:hRule="atLeast"/>
-          <w:tblCellSpacing w:w="15" w:type="dxa"/>
-        </w:trPr>
-        <w:tc>
-          <w:tcPr>
-            <w:tcW w:w="0" w:type="auto"/>
-            <w:shd w:val="clear" w:color="auto" w:fill="auto"/>
-            <w:vAlign w:val="center"/>
-          </w:tcPr>
-          <w:p>
-            <w:pPr>
-              <w:keepNext w:val="0"/>
-              <w:keepLines w:val="0"/>
-              <w:widowControl/>
-              <w:suppressLineNumbers w:val="0"/>
-              <w:jc w:val="left"/>
-            </w:pPr>
-            <w:r>
-              <w:rPr>
-                <w:rFonts w:ascii="SimSun" w:hAnsi="SimSun" w:eastAsia="SimSun" w:cs="SimSun"/>
-                <w:kern w:val="0"/>
-                <w:sz w:val="24"/>
-                <w:szCs w:val="24"/>
-                <w:lang w:val="en-US" w:eastAsia="zh-CN" w:bidi="ar"/>
-              </w:rPr>
-              <w:t>Index access</w:t>
-            </w:r>
-          </w:p>
-        </w:tc>
-        <w:tc>
-          <w:tcPr>
-            <w:tcW w:w="1363" w:type="dxa"/>
-            <w:shd w:val="clear" w:color="auto" w:fill="auto"/>
-            <w:vAlign w:val="center"/>
-          </w:tcPr>
-          <w:p>
-            <w:pPr>
-              <w:keepNext w:val="0"/>
-              <w:keepLines w:val="0"/>
-              <w:widowControl/>
-              <w:suppressLineNumbers w:val="0"/>
-              <w:jc w:val="left"/>
-            </w:pPr>
-            <w:r>
-              <w:rPr>
-                <w:rFonts w:ascii="SimSun" w:hAnsi="SimSun" w:eastAsia="SimSun" w:cs="SimSun"/>
-                <w:kern w:val="0"/>
-                <w:sz w:val="24"/>
-                <w:szCs w:val="24"/>
-                <w:lang w:val="en-US" w:eastAsia="zh-CN" w:bidi="ar"/>
-              </w:rPr>
-              <w:t>No index</w:t>
-            </w:r>
-          </w:p>
-        </w:tc>
-      </w:tr>
-      <w:tr>
-        <w:tblPrEx>
-          <w:tblBorders>
-            <w:top w:val="none" w:color="auto" w:sz="0" w:space="0"/>
-            <w:left w:val="none" w:color="auto" w:sz="0" w:space="0"/>
-            <w:bottom w:val="none" w:color="auto" w:sz="0" w:space="0"/>
-            <w:right w:val="none" w:color="auto" w:sz="0" w:space="0"/>
-            <w:insideH w:val="none" w:color="auto" w:sz="0" w:space="0"/>
-            <w:insideV w:val="none" w:color="auto" w:sz="0" w:space="0"/>
-          </w:tblBorders>
-          <w:shd w:val="clear" w:color="auto" w:fill="auto"/>
-          <w:tblCellMar>
-            <w:top w:w="15" w:type="dxa"/>
-            <w:left w:w="15" w:type="dxa"/>
-            <w:bottom w:w="15" w:type="dxa"/>
-            <w:right w:w="15" w:type="dxa"/>
-          </w:tblCellMar>
-        </w:tblPrEx>
-        <w:trPr>
-          <w:trHeight w:val="382" w:hRule="atLeast"/>
-          <w:tblCellSpacing w:w="15" w:type="dxa"/>
-        </w:trPr>
-        <w:tc>
-          <w:tcPr>
-            <w:tcW w:w="0" w:type="auto"/>
-            <w:shd w:val="clear" w:color="auto" w:fill="auto"/>
-            <w:vAlign w:val="center"/>
-          </w:tcPr>
-          <w:p>
-            <w:pPr>
-              <w:keepNext w:val="0"/>
-              <w:keepLines w:val="0"/>
-              <w:widowControl/>
-              <w:suppressLineNumbers w:val="0"/>
-              <w:jc w:val="left"/>
-            </w:pPr>
-            <w:r>
-              <w:rPr>
-                <w:rFonts w:ascii="SimSun" w:hAnsi="SimSun" w:eastAsia="SimSun" w:cs="SimSun"/>
-                <w:kern w:val="0"/>
-                <w:sz w:val="24"/>
-                <w:szCs w:val="24"/>
-                <w:lang w:val="en-US" w:eastAsia="zh-CN" w:bidi="ar"/>
-              </w:rPr>
-              <w:t>Can modify elements</w:t>
-            </w:r>
-          </w:p>
-        </w:tc>
-        <w:tc>
-          <w:tcPr>
-            <w:tcW w:w="1363" w:type="dxa"/>
-            <w:shd w:val="clear" w:color="auto" w:fill="auto"/>
-            <w:vAlign w:val="center"/>
-          </w:tcPr>
-          <w:p>
-            <w:pPr>
-              <w:keepNext w:val="0"/>
-              <w:keepLines w:val="0"/>
-              <w:widowControl/>
-              <w:suppressLineNumbers w:val="0"/>
-              <w:jc w:val="left"/>
-            </w:pPr>
-            <w:r>
-              <w:rPr>
-                <w:rFonts w:ascii="SimSun" w:hAnsi="SimSun" w:eastAsia="SimSun" w:cs="SimSun"/>
-                <w:kern w:val="0"/>
-                <w:sz w:val="24"/>
-                <w:szCs w:val="24"/>
-                <w:lang w:val="en-US" w:eastAsia="zh-CN" w:bidi="ar"/>
-              </w:rPr>
-              <w:t>Read-only</w:t>
-            </w:r>
-          </w:p>
-        </w:tc>
-      </w:tr>
-      <w:tr>
-        <w:tblPrEx>
-          <w:tblBorders>
-            <w:top w:val="none" w:color="auto" w:sz="0" w:space="0"/>
-            <w:left w:val="none" w:color="auto" w:sz="0" w:space="0"/>
-            <w:bottom w:val="none" w:color="auto" w:sz="0" w:space="0"/>
-            <w:right w:val="none" w:color="auto" w:sz="0" w:space="0"/>
-            <w:insideH w:val="none" w:color="auto" w:sz="0" w:space="0"/>
-            <w:insideV w:val="none" w:color="auto" w:sz="0" w:space="0"/>
-          </w:tblBorders>
-          <w:shd w:val="clear" w:color="auto" w:fill="auto"/>
-          <w:tblCellMar>
-            <w:top w:w="15" w:type="dxa"/>
-            <w:left w:w="15" w:type="dxa"/>
-            <w:bottom w:w="15" w:type="dxa"/>
-            <w:right w:w="15" w:type="dxa"/>
-          </w:tblCellMar>
-        </w:tblPrEx>
-        <w:trPr>
-          <w:trHeight w:val="392" w:hRule="atLeast"/>
-          <w:tblCellSpacing w:w="15" w:type="dxa"/>
-        </w:trPr>
-        <w:tc>
-          <w:tcPr>
-            <w:tcW w:w="0" w:type="auto"/>
-            <w:shd w:val="clear" w:color="auto" w:fill="auto"/>
-            <w:vAlign w:val="center"/>
-          </w:tcPr>
-          <w:p>
-            <w:pPr>
-              <w:keepNext w:val="0"/>
-              <w:keepLines w:val="0"/>
-              <w:widowControl/>
-              <w:suppressLineNumbers w:val="0"/>
-              <w:jc w:val="left"/>
-            </w:pPr>
-            <w:r>
-              <w:rPr>
-                <w:rFonts w:ascii="SimSun" w:hAnsi="SimSun" w:eastAsia="SimSun" w:cs="SimSun"/>
-                <w:kern w:val="0"/>
-                <w:sz w:val="24"/>
-                <w:szCs w:val="24"/>
-                <w:lang w:val="en-US" w:eastAsia="zh-CN" w:bidi="ar"/>
-              </w:rPr>
-              <w:t>More control</w:t>
-            </w:r>
-          </w:p>
-        </w:tc>
-        <w:tc>
-          <w:tcPr>
-            <w:tcW w:w="1363" w:type="dxa"/>
-            <w:shd w:val="clear" w:color="auto" w:fill="auto"/>
-            <w:vAlign w:val="center"/>
-          </w:tcPr>
-          <w:p>
-            <w:pPr>
-              <w:keepNext w:val="0"/>
-              <w:keepLines w:val="0"/>
-              <w:widowControl/>
-              <w:suppressLineNumbers w:val="0"/>
-              <w:jc w:val="left"/>
-            </w:pPr>
-            <w:r>
-              <w:rPr>
-                <w:rFonts w:ascii="SimSun" w:hAnsi="SimSun" w:eastAsia="SimSun" w:cs="SimSun"/>
-                <w:kern w:val="0"/>
-                <w:sz w:val="24"/>
-                <w:szCs w:val="24"/>
-                <w:lang w:val="en-US" w:eastAsia="zh-CN" w:bidi="ar"/>
-              </w:rPr>
-              <w:t>Cleaner syntax</w:t>
-            </w:r>
-          </w:p>
-        </w:tc>
-      </w:tr>
-    </w:tbl>
     <w:p>
       <w:pPr>
         <w:pStyle w:val="3"/>
@@ -10472,11 +10943,15 @@
         <w:bidi w:val="0"/>
         <w:rPr>
           <w:rFonts w:hint="default"/>
+          <w:sz w:val="24"/>
+          <w:szCs w:val="24"/>
         </w:rPr>
       </w:pPr>
       <w:r>
         <w:rPr>
           <w:rFonts w:hint="default"/>
+          <w:sz w:val="24"/>
+          <w:szCs w:val="24"/>
         </w:rPr>
         <w:t>int day = ;</w:t>
       </w:r>
@@ -10486,11 +10961,15 @@
         <w:bidi w:val="0"/>
         <w:rPr>
           <w:rFonts w:hint="default"/>
+          <w:sz w:val="24"/>
+          <w:szCs w:val="24"/>
         </w:rPr>
       </w:pPr>
       <w:r>
         <w:rPr>
           <w:rFonts w:hint="default"/>
+          <w:sz w:val="24"/>
+          <w:szCs w:val="24"/>
         </w:rPr>
         <w:t>switch (day) {</w:t>
       </w:r>
@@ -10500,11 +10979,15 @@
         <w:bidi w:val="0"/>
         <w:rPr>
           <w:rFonts w:hint="default"/>
+          <w:sz w:val="24"/>
+          <w:szCs w:val="24"/>
         </w:rPr>
       </w:pPr>
       <w:r>
         <w:rPr>
           <w:rFonts w:hint="default"/>
+          <w:sz w:val="24"/>
+          <w:szCs w:val="24"/>
         </w:rPr>
         <w:t xml:space="preserve">  case 6:</w:t>
       </w:r>
@@ -10514,11 +10997,15 @@
         <w:bidi w:val="0"/>
         <w:rPr>
           <w:rFonts w:hint="default"/>
+          <w:sz w:val="24"/>
+          <w:szCs w:val="24"/>
         </w:rPr>
       </w:pPr>
       <w:r>
         <w:rPr>
           <w:rFonts w:hint="default"/>
+          <w:sz w:val="24"/>
+          <w:szCs w:val="24"/>
         </w:rPr>
         <w:t xml:space="preserve">    System.out.println("Today is Saturday");</w:t>
       </w:r>
@@ -10528,11 +11015,15 @@
         <w:bidi w:val="0"/>
         <w:rPr>
           <w:rFonts w:hint="default"/>
+          <w:sz w:val="24"/>
+          <w:szCs w:val="24"/>
         </w:rPr>
       </w:pPr>
       <w:r>
         <w:rPr>
           <w:rFonts w:hint="default"/>
+          <w:sz w:val="24"/>
+          <w:szCs w:val="24"/>
         </w:rPr>
         <w:t xml:space="preserve">    break;</w:t>
       </w:r>
@@ -10542,11 +11033,15 @@
         <w:bidi w:val="0"/>
         <w:rPr>
           <w:rFonts w:hint="default"/>
+          <w:sz w:val="24"/>
+          <w:szCs w:val="24"/>
         </w:rPr>
       </w:pPr>
       <w:r>
         <w:rPr>
           <w:rFonts w:hint="default"/>
+          <w:sz w:val="24"/>
+          <w:szCs w:val="24"/>
         </w:rPr>
         <w:t xml:space="preserve">  case 7:</w:t>
       </w:r>
@@ -10556,11 +11051,15 @@
         <w:bidi w:val="0"/>
         <w:rPr>
           <w:rFonts w:hint="default"/>
+          <w:sz w:val="24"/>
+          <w:szCs w:val="24"/>
         </w:rPr>
       </w:pPr>
       <w:r>
         <w:rPr>
           <w:rFonts w:hint="default"/>
+          <w:sz w:val="24"/>
+          <w:szCs w:val="24"/>
         </w:rPr>
         <w:t xml:space="preserve">    System.out.println("Today is Sunday");</w:t>
       </w:r>
@@ -10570,11 +11069,15 @@
         <w:bidi w:val="0"/>
         <w:rPr>
           <w:rFonts w:hint="default"/>
+          <w:sz w:val="24"/>
+          <w:szCs w:val="24"/>
         </w:rPr>
       </w:pPr>
       <w:r>
         <w:rPr>
           <w:rFonts w:hint="default"/>
+          <w:sz w:val="24"/>
+          <w:szCs w:val="24"/>
         </w:rPr>
         <w:t xml:space="preserve">    break;</w:t>
       </w:r>
@@ -10584,11 +11087,15 @@
         <w:bidi w:val="0"/>
         <w:rPr>
           <w:rFonts w:hint="default"/>
+          <w:sz w:val="24"/>
+          <w:szCs w:val="24"/>
         </w:rPr>
       </w:pPr>
       <w:r>
         <w:rPr>
           <w:rFonts w:hint="default"/>
+          <w:sz w:val="24"/>
+          <w:szCs w:val="24"/>
         </w:rPr>
         <w:t xml:space="preserve">  default:</w:t>
       </w:r>
@@ -10596,10 +11103,16 @@
     <w:p>
       <w:pPr>
         <w:bidi w:val="0"/>
+        <w:rPr>
+          <w:sz w:val="24"/>
+          <w:szCs w:val="24"/>
+        </w:rPr>
       </w:pPr>
       <w:r>
         <w:rPr>
           <w:rFonts w:hint="default"/>
+          <w:sz w:val="24"/>
+          <w:szCs w:val="24"/>
         </w:rPr>
         <w:t xml:space="preserve">    System.out.println("Looking forward to the Weekend");}</w:t>
       </w:r>
@@ -10639,16 +11152,32 @@
     <w:p>
       <w:pPr>
         <w:bidi w:val="0"/>
-      </w:pPr>
-      <w:r>
+        <w:rPr>
+          <w:sz w:val="24"/>
+          <w:szCs w:val="24"/>
+        </w:rPr>
+      </w:pPr>
+      <w:r>
+        <w:rPr>
+          <w:sz w:val="24"/>
+          <w:szCs w:val="24"/>
+        </w:rPr>
         <w:t>The Scanner class is used to get user input, and it is found in the java.util package.</w:t>
       </w:r>
     </w:p>
     <w:p>
       <w:pPr>
         <w:bidi w:val="0"/>
-      </w:pPr>
-      <w:r>
+        <w:rPr>
+          <w:sz w:val="24"/>
+          <w:szCs w:val="24"/>
+        </w:rPr>
+      </w:pPr>
+      <w:r>
+        <w:rPr>
+          <w:sz w:val="24"/>
+          <w:szCs w:val="24"/>
+        </w:rPr>
         <w:t>To use the Scanner class, create an object of the class and use any of the available methods found in the Scanner class documentation. In our example, we will use the nextLine() method, which is used to read Strings:</w:t>
       </w:r>
     </w:p>
@@ -10656,11 +11185,15 @@
       <w:pPr>
         <w:bidi w:val="0"/>
         <w:rPr>
-          <w:highlight w:val="yellow"/>
-        </w:rPr>
-      </w:pPr>
-      <w:r>
-        <w:rPr>
+          <w:sz w:val="24"/>
+          <w:szCs w:val="24"/>
+          <w:highlight w:val="yellow"/>
+        </w:rPr>
+      </w:pPr>
+      <w:r>
+        <w:rPr>
+          <w:sz w:val="24"/>
+          <w:szCs w:val="24"/>
           <w:highlight w:val="yellow"/>
         </w:rPr>
         <w:t>import java.util.Scanner;  // Import the Scanner class</w:t>
@@ -10672,8 +11205,8 @@
           <w:rStyle w:val="17"/>
           <w:rFonts w:ascii="Consolas" w:hAnsi="Consolas" w:eastAsia="Times New Roman" w:cs="Courier New"/>
           <w:color w:val="auto"/>
-          <w:sz w:val="23"/>
-          <w:szCs w:val="23"/>
+          <w:sz w:val="24"/>
+          <w:szCs w:val="24"/>
           <w:highlight w:val="yellow"/>
           <w:lang w:eastAsia="en-IN"/>
         </w:rPr>
@@ -10683,8 +11216,8 @@
           <w:rStyle w:val="17"/>
           <w:rFonts w:ascii="Consolas" w:hAnsi="Consolas" w:eastAsia="Times New Roman" w:cs="Courier New"/>
           <w:color w:val="auto"/>
-          <w:sz w:val="23"/>
-          <w:szCs w:val="23"/>
+          <w:sz w:val="24"/>
+          <w:szCs w:val="24"/>
           <w:highlight w:val="yellow"/>
           <w:lang w:eastAsia="en-IN"/>
         </w:rPr>
@@ -10697,8 +11230,8 @@
           <w:rStyle w:val="17"/>
           <w:rFonts w:ascii="Consolas" w:hAnsi="Consolas" w:eastAsia="Times New Roman" w:cs="Courier New"/>
           <w:color w:val="auto"/>
-          <w:sz w:val="23"/>
-          <w:szCs w:val="23"/>
+          <w:sz w:val="24"/>
+          <w:szCs w:val="24"/>
           <w:lang w:eastAsia="en-IN"/>
         </w:rPr>
       </w:pPr>
@@ -10709,8 +11242,8 @@
           <w:rStyle w:val="17"/>
           <w:rFonts w:ascii="Consolas" w:hAnsi="Consolas" w:eastAsia="Times New Roman" w:cs="Courier New"/>
           <w:color w:val="auto"/>
-          <w:sz w:val="22"/>
-          <w:szCs w:val="22"/>
+          <w:sz w:val="24"/>
+          <w:szCs w:val="24"/>
           <w:highlight w:val="yellow"/>
           <w:lang w:eastAsia="en-IN"/>
         </w:rPr>
@@ -10720,8 +11253,8 @@
           <w:rStyle w:val="17"/>
           <w:rFonts w:ascii="Consolas" w:hAnsi="Consolas" w:eastAsia="Times New Roman" w:cs="Courier New"/>
           <w:color w:val="auto"/>
-          <w:sz w:val="22"/>
-          <w:szCs w:val="22"/>
+          <w:sz w:val="24"/>
+          <w:szCs w:val="24"/>
           <w:highlight w:val="yellow"/>
           <w:lang w:eastAsia="en-IN"/>
         </w:rPr>
@@ -10734,8 +11267,8 @@
           <w:rStyle w:val="17"/>
           <w:rFonts w:ascii="Consolas" w:hAnsi="Consolas" w:eastAsia="Times New Roman" w:cs="Courier New"/>
           <w:color w:val="auto"/>
-          <w:sz w:val="22"/>
-          <w:szCs w:val="22"/>
+          <w:sz w:val="24"/>
+          <w:szCs w:val="24"/>
           <w:highlight w:val="yellow"/>
           <w:lang w:eastAsia="en-IN"/>
         </w:rPr>
@@ -10745,8 +11278,8 @@
           <w:rStyle w:val="17"/>
           <w:rFonts w:ascii="Consolas" w:hAnsi="Consolas" w:eastAsia="Times New Roman" w:cs="Courier New"/>
           <w:color w:val="auto"/>
-          <w:sz w:val="22"/>
-          <w:szCs w:val="22"/>
+          <w:sz w:val="24"/>
+          <w:szCs w:val="24"/>
           <w:highlight w:val="yellow"/>
           <w:lang w:eastAsia="en-IN"/>
         </w:rPr>
@@ -10759,8 +11292,8 @@
           <w:rStyle w:val="17"/>
           <w:rFonts w:ascii="Consolas" w:hAnsi="Consolas" w:eastAsia="Times New Roman" w:cs="Courier New"/>
           <w:color w:val="auto"/>
-          <w:sz w:val="22"/>
-          <w:szCs w:val="22"/>
+          <w:sz w:val="24"/>
+          <w:szCs w:val="24"/>
           <w:highlight w:val="yellow"/>
           <w:lang w:eastAsia="en-IN"/>
         </w:rPr>
@@ -10770,8 +11303,8 @@
           <w:rStyle w:val="17"/>
           <w:rFonts w:ascii="Consolas" w:hAnsi="Consolas" w:eastAsia="Times New Roman" w:cs="Courier New"/>
           <w:color w:val="auto"/>
-          <w:sz w:val="22"/>
-          <w:szCs w:val="22"/>
+          <w:sz w:val="24"/>
+          <w:szCs w:val="24"/>
           <w:highlight w:val="yellow"/>
           <w:lang w:eastAsia="en-IN"/>
         </w:rPr>
@@ -10784,8 +11317,8 @@
           <w:rStyle w:val="17"/>
           <w:rFonts w:ascii="Consolas" w:hAnsi="Consolas" w:eastAsia="Times New Roman" w:cs="Courier New"/>
           <w:color w:val="auto"/>
-          <w:sz w:val="22"/>
-          <w:szCs w:val="22"/>
+          <w:sz w:val="24"/>
+          <w:szCs w:val="24"/>
           <w:highlight w:val="yellow"/>
           <w:lang w:eastAsia="en-IN"/>
         </w:rPr>
@@ -10795,8 +11328,8 @@
           <w:rStyle w:val="17"/>
           <w:rFonts w:ascii="Consolas" w:hAnsi="Consolas" w:eastAsia="Times New Roman" w:cs="Courier New"/>
           <w:color w:val="auto"/>
-          <w:sz w:val="22"/>
-          <w:szCs w:val="22"/>
+          <w:sz w:val="24"/>
+          <w:szCs w:val="24"/>
           <w:highlight w:val="yellow"/>
           <w:lang w:eastAsia="en-IN"/>
         </w:rPr>
@@ -10809,8 +11342,8 @@
           <w:rStyle w:val="17"/>
           <w:rFonts w:ascii="Consolas" w:hAnsi="Consolas" w:eastAsia="Times New Roman" w:cs="Courier New"/>
           <w:color w:val="auto"/>
-          <w:sz w:val="22"/>
-          <w:szCs w:val="22"/>
+          <w:sz w:val="24"/>
+          <w:szCs w:val="24"/>
           <w:highlight w:val="yellow"/>
           <w:lang w:eastAsia="en-IN"/>
         </w:rPr>
@@ -10820,8 +11353,8 @@
           <w:rStyle w:val="17"/>
           <w:rFonts w:ascii="Consolas" w:hAnsi="Consolas" w:eastAsia="Times New Roman" w:cs="Courier New"/>
           <w:color w:val="auto"/>
-          <w:sz w:val="22"/>
-          <w:szCs w:val="22"/>
+          <w:sz w:val="24"/>
+          <w:szCs w:val="24"/>
           <w:highlight w:val="yellow"/>
           <w:lang w:eastAsia="en-IN"/>
         </w:rPr>
@@ -10834,8 +11367,8 @@
           <w:rStyle w:val="17"/>
           <w:rFonts w:ascii="Consolas" w:hAnsi="Consolas" w:eastAsia="Times New Roman" w:cs="Courier New"/>
           <w:color w:val="auto"/>
-          <w:sz w:val="22"/>
-          <w:szCs w:val="22"/>
+          <w:sz w:val="24"/>
+          <w:szCs w:val="24"/>
           <w:highlight w:val="yellow"/>
           <w:lang w:eastAsia="en-IN"/>
         </w:rPr>
@@ -10845,8 +11378,8 @@
           <w:rStyle w:val="17"/>
           <w:rFonts w:ascii="Consolas" w:hAnsi="Consolas" w:eastAsia="Times New Roman" w:cs="Courier New"/>
           <w:color w:val="auto"/>
-          <w:sz w:val="22"/>
-          <w:szCs w:val="22"/>
+          <w:sz w:val="24"/>
+          <w:szCs w:val="24"/>
           <w:highlight w:val="yellow"/>
           <w:lang w:eastAsia="en-IN"/>
         </w:rPr>
@@ -10859,8 +11392,8 @@
           <w:rStyle w:val="17"/>
           <w:rFonts w:ascii="Consolas" w:hAnsi="Consolas" w:eastAsia="Times New Roman" w:cs="Courier New"/>
           <w:color w:val="auto"/>
-          <w:sz w:val="22"/>
-          <w:szCs w:val="22"/>
+          <w:sz w:val="24"/>
+          <w:szCs w:val="24"/>
           <w:highlight w:val="yellow"/>
           <w:lang w:eastAsia="en-IN"/>
         </w:rPr>
@@ -10870,8 +11403,8 @@
           <w:rStyle w:val="17"/>
           <w:rFonts w:ascii="Consolas" w:hAnsi="Consolas" w:eastAsia="Times New Roman" w:cs="Courier New"/>
           <w:color w:val="auto"/>
-          <w:sz w:val="22"/>
-          <w:szCs w:val="22"/>
+          <w:sz w:val="24"/>
+          <w:szCs w:val="24"/>
           <w:highlight w:val="yellow"/>
           <w:lang w:eastAsia="en-IN"/>
         </w:rPr>
@@ -10884,8 +11417,8 @@
           <w:rStyle w:val="17"/>
           <w:rFonts w:ascii="Consolas" w:hAnsi="Consolas" w:eastAsia="Times New Roman" w:cs="Courier New"/>
           <w:color w:val="auto"/>
-          <w:sz w:val="22"/>
-          <w:szCs w:val="22"/>
+          <w:sz w:val="24"/>
+          <w:szCs w:val="24"/>
           <w:highlight w:val="yellow"/>
           <w:lang w:eastAsia="en-IN"/>
         </w:rPr>
@@ -10895,8 +11428,8 @@
           <w:rStyle w:val="17"/>
           <w:rFonts w:ascii="Consolas" w:hAnsi="Consolas" w:eastAsia="Times New Roman" w:cs="Courier New"/>
           <w:color w:val="auto"/>
-          <w:sz w:val="22"/>
-          <w:szCs w:val="22"/>
+          <w:sz w:val="24"/>
+          <w:szCs w:val="24"/>
           <w:highlight w:val="yellow"/>
           <w:lang w:eastAsia="en-IN"/>
         </w:rPr>
@@ -10909,8 +11442,8 @@
           <w:rStyle w:val="17"/>
           <w:rFonts w:ascii="Consolas" w:hAnsi="Consolas" w:eastAsia="Times New Roman" w:cs="Courier New"/>
           <w:color w:val="auto"/>
-          <w:sz w:val="22"/>
-          <w:szCs w:val="22"/>
+          <w:sz w:val="24"/>
+          <w:szCs w:val="24"/>
           <w:highlight w:val="yellow"/>
           <w:lang w:eastAsia="en-IN"/>
         </w:rPr>
@@ -10920,8 +11453,8 @@
           <w:rStyle w:val="17"/>
           <w:rFonts w:ascii="Consolas" w:hAnsi="Consolas" w:eastAsia="Times New Roman" w:cs="Courier New"/>
           <w:color w:val="auto"/>
-          <w:sz w:val="22"/>
-          <w:szCs w:val="22"/>
+          <w:sz w:val="24"/>
+          <w:szCs w:val="24"/>
           <w:highlight w:val="yellow"/>
           <w:lang w:eastAsia="en-IN"/>
         </w:rPr>
@@ -10934,8 +11467,8 @@
           <w:rStyle w:val="17"/>
           <w:rFonts w:ascii="Consolas" w:hAnsi="Consolas" w:eastAsia="Times New Roman" w:cs="Courier New"/>
           <w:color w:val="auto"/>
-          <w:sz w:val="22"/>
-          <w:szCs w:val="22"/>
+          <w:sz w:val="24"/>
+          <w:szCs w:val="24"/>
           <w:highlight w:val="yellow"/>
           <w:lang w:eastAsia="en-IN"/>
         </w:rPr>
@@ -10945,8 +11478,8 @@
           <w:rStyle w:val="17"/>
           <w:rFonts w:ascii="Consolas" w:hAnsi="Consolas" w:eastAsia="Times New Roman" w:cs="Courier New"/>
           <w:color w:val="auto"/>
-          <w:sz w:val="22"/>
-          <w:szCs w:val="22"/>
+          <w:sz w:val="24"/>
+          <w:szCs w:val="24"/>
           <w:highlight w:val="yellow"/>
           <w:lang w:eastAsia="en-IN"/>
         </w:rPr>
@@ -10959,8 +11492,8 @@
           <w:rStyle w:val="17"/>
           <w:rFonts w:ascii="Consolas" w:hAnsi="Consolas" w:eastAsia="Times New Roman" w:cs="Courier New"/>
           <w:color w:val="auto"/>
-          <w:sz w:val="22"/>
-          <w:szCs w:val="22"/>
+          <w:sz w:val="24"/>
+          <w:szCs w:val="24"/>
           <w:highlight w:val="yellow"/>
           <w:lang w:eastAsia="en-IN"/>
         </w:rPr>
@@ -10970,8 +11503,8 @@
           <w:rStyle w:val="17"/>
           <w:rFonts w:ascii="Consolas" w:hAnsi="Consolas" w:eastAsia="Times New Roman" w:cs="Courier New"/>
           <w:color w:val="auto"/>
-          <w:sz w:val="22"/>
-          <w:szCs w:val="22"/>
+          <w:sz w:val="24"/>
+          <w:szCs w:val="24"/>
           <w:highlight w:val="yellow"/>
           <w:lang w:eastAsia="en-IN"/>
         </w:rPr>
@@ -10984,8 +11517,8 @@
           <w:rStyle w:val="17"/>
           <w:rFonts w:ascii="Consolas" w:hAnsi="Consolas" w:eastAsia="Times New Roman" w:cs="Courier New"/>
           <w:color w:val="auto"/>
-          <w:sz w:val="22"/>
-          <w:szCs w:val="22"/>
+          <w:sz w:val="24"/>
+          <w:szCs w:val="24"/>
           <w:highlight w:val="yellow"/>
           <w:lang w:eastAsia="en-IN"/>
         </w:rPr>
@@ -10995,8 +11528,8 @@
           <w:rStyle w:val="17"/>
           <w:rFonts w:ascii="Consolas" w:hAnsi="Consolas" w:eastAsia="Times New Roman" w:cs="Courier New"/>
           <w:color w:val="auto"/>
-          <w:sz w:val="22"/>
-          <w:szCs w:val="22"/>
+          <w:sz w:val="24"/>
+          <w:szCs w:val="24"/>
           <w:highlight w:val="yellow"/>
           <w:lang w:eastAsia="en-IN"/>
         </w:rPr>
@@ -11007,16 +11540,16 @@
       <w:pPr>
         <w:rPr>
           <w:rFonts w:ascii="Consolas" w:hAnsi="Consolas"/>
-          <w:sz w:val="21"/>
-          <w:szCs w:val="21"/>
+          <w:sz w:val="22"/>
+          <w:szCs w:val="22"/>
           <w:highlight w:val="yellow"/>
         </w:rPr>
       </w:pPr>
       <w:r>
         <w:rPr>
           <w:rFonts w:ascii="Consolas" w:hAnsi="Consolas"/>
-          <w:sz w:val="21"/>
-          <w:szCs w:val="21"/>
+          <w:sz w:val="22"/>
+          <w:szCs w:val="22"/>
           <w:highlight w:val="yellow"/>
         </w:rPr>
         <w:t>nextInt() = for taking next int as input.</w:t>
@@ -11288,17 +11821,17 @@
           <w:szCs w:val="24"/>
           <w:lang w:eastAsia="en-IN"/>
         </w:rPr>
-        <w:t>        </w:t>
-      </w:r>
-      <w:r>
-        <w:rPr>
-          <w:rFonts w:ascii="Segoe UI" w:hAnsi="Segoe UI" w:eastAsia="Times New Roman" w:cs="Segoe UI"/>
-          <w:color w:val="008200"/>
-          <w:sz w:val="24"/>
-          <w:szCs w:val="24"/>
-          <w:lang w:eastAsia="en-IN"/>
-        </w:rPr>
-        <w:t>//2nd way</w:t>
+        <w:t>      </w:t>
+      </w:r>
+      <w:r>
+        <w:rPr>
+          <w:rFonts w:hint="default" w:ascii="Segoe UI" w:hAnsi="Segoe UI" w:eastAsia="Times New Roman" w:cs="Segoe UI"/>
+          <w:color w:val="000000"/>
+          <w:sz w:val="24"/>
+          <w:szCs w:val="24"/>
+          <w:lang w:val="en-US" w:eastAsia="en-IN"/>
+        </w:rPr>
+        <w:t xml:space="preserve"> </w:t>
       </w:r>
       <w:r>
         <w:rPr>
@@ -11308,7 +11841,7 @@
           <w:szCs w:val="24"/>
           <w:lang w:eastAsia="en-IN"/>
         </w:rPr>
-        <w:t>  ( use this mostly)</w:t>
+        <w:t> ( use this mostly)</w:t>
       </w:r>
     </w:p>
     <w:p>
@@ -11508,8 +12041,8 @@
           <w:caps w:val="0"/>
           <w:color w:val="2B2A29"/>
           <w:spacing w:val="0"/>
-          <w:sz w:val="21"/>
-          <w:szCs w:val="21"/>
+          <w:sz w:val="24"/>
+          <w:szCs w:val="24"/>
         </w:rPr>
       </w:pPr>
       <w:r>
@@ -11520,8 +12053,8 @@
           <w:caps w:val="0"/>
           <w:color w:val="2B2A29"/>
           <w:spacing w:val="0"/>
-          <w:sz w:val="21"/>
-          <w:szCs w:val="21"/>
+          <w:sz w:val="24"/>
+          <w:szCs w:val="24"/>
           <w:shd w:val="clear" w:fill="FFFFFF"/>
         </w:rPr>
         <w:t>In java, garbage means unreferenced objects.</w:t>
@@ -11545,8 +12078,8 @@
           <w:caps w:val="0"/>
           <w:color w:val="2B2A29"/>
           <w:spacing w:val="0"/>
-          <w:sz w:val="21"/>
-          <w:szCs w:val="21"/>
+          <w:sz w:val="24"/>
+          <w:szCs w:val="24"/>
         </w:rPr>
       </w:pPr>
       <w:r>
@@ -11557,8 +12090,8 @@
           <w:caps w:val="0"/>
           <w:color w:val="2B2A29"/>
           <w:spacing w:val="0"/>
-          <w:sz w:val="21"/>
-          <w:szCs w:val="21"/>
+          <w:sz w:val="24"/>
+          <w:szCs w:val="24"/>
           <w:shd w:val="clear" w:fill="FFFFFF"/>
         </w:rPr>
         <w:t>Garbage Collection is process of reclaiming the runtime unused memory automatically. In other words, it is a way to destroy the unused objects.</w:t>
@@ -11578,8 +12111,8 @@
           <w:caps w:val="0"/>
           <w:color w:val="2B2A29"/>
           <w:spacing w:val="0"/>
-          <w:sz w:val="21"/>
-          <w:szCs w:val="21"/>
+          <w:sz w:val="24"/>
+          <w:szCs w:val="24"/>
           <w:shd w:val="clear" w:fill="FFFFFF"/>
         </w:rPr>
       </w:pPr>
@@ -11591,8 +12124,8 @@
           <w:caps w:val="0"/>
           <w:color w:val="2B2A29"/>
           <w:spacing w:val="0"/>
-          <w:sz w:val="21"/>
-          <w:szCs w:val="21"/>
+          <w:sz w:val="24"/>
+          <w:szCs w:val="24"/>
           <w:shd w:val="clear" w:fill="FFFFFF"/>
         </w:rPr>
         <w:t>To do so, we were using free() function in C language and delete() in C++. But, in java it is performed automatically. So, java provides better memory management.</w:t>
@@ -11617,33 +12150,41 @@
           <w:caps w:val="0"/>
           <w:color w:val="2B2A29"/>
           <w:spacing w:val="0"/>
+          <w:sz w:val="22"/>
+          <w:szCs w:val="22"/>
+          <w:shd w:val="clear" w:fill="FFFFFF"/>
+        </w:rPr>
+        <w:br w:type="textWrapping"/>
+      </w:r>
+      <w:r>
+        <w:rPr>
+          <w:sz w:val="28"/>
+          <w:szCs w:val="28"/>
+          <w:highlight w:val="yellow"/>
+        </w:rPr>
+        <w:t xml:space="preserve">In Java, the garbage collector runs automatically to free memory by identifying objects that are no longer referenced. When an object is eligible for garbage collection, the JVM may call its </w:t>
+      </w:r>
+      <w:r>
+        <w:rPr>
+          <w:rStyle w:val="10"/>
           <w:sz w:val="21"/>
           <w:szCs w:val="21"/>
-          <w:shd w:val="clear" w:fill="FFFFFF"/>
-        </w:rPr>
-        <w:br w:type="textWrapping"/>
-      </w:r>
-      <w:r>
-        <w:rPr>
-          <w:highlight w:val="yellow"/>
-        </w:rPr>
-        <w:t xml:space="preserve">In Java, the garbage collector runs automatically to free memory by identifying objects that are no longer referenced. When an object is eligible for garbage collection, the JVM may call its </w:t>
-      </w:r>
-      <w:r>
-        <w:rPr>
-          <w:rStyle w:val="10"/>
           <w:highlight w:val="yellow"/>
         </w:rPr>
         <w:t>finalize()</w:t>
       </w:r>
       <w:r>
         <w:rPr>
+          <w:sz w:val="28"/>
+          <w:szCs w:val="28"/>
           <w:highlight w:val="yellow"/>
         </w:rPr>
         <w:t xml:space="preserve"> method just before actually collecting it. After that, the memory is reclaimed and the object is removed from the heap.</w:t>
       </w:r>
       <w:r>
         <w:rPr>
+          <w:sz w:val="28"/>
+          <w:szCs w:val="28"/>
           <w:highlight w:val="yellow"/>
         </w:rPr>
         <w:br w:type="textWrapping"/>
@@ -15449,6 +15990,249 @@
         </w:rPr>
         <w:t>Commans JVM Errors</w:t>
       </w:r>
+    </w:p>
+    <w:p>
+      <w:pPr>
+        <w:numPr>
+          <w:ilvl w:val="0"/>
+          <w:numId w:val="10"/>
+        </w:numPr>
+        <w:rPr>
+          <w:rFonts w:hint="eastAsia" w:ascii="SimSun" w:hAnsi="SimSun" w:eastAsia="SimSun" w:cs="SimSun"/>
+          <w:sz w:val="24"/>
+          <w:szCs w:val="24"/>
+          <w:shd w:val="clear" w:fill="FFFFFF"/>
+        </w:rPr>
+      </w:pPr>
+      <w:r>
+        <w:rPr>
+          <w:rFonts w:hint="eastAsia" w:ascii="SimSun" w:hAnsi="SimSun" w:eastAsia="SimSun" w:cs="SimSun"/>
+          <w:b/>
+          <w:bCs/>
+          <w:kern w:val="0"/>
+          <w:sz w:val="24"/>
+          <w:szCs w:val="24"/>
+          <w:lang w:val="en-US" w:eastAsia="zh-CN" w:bidi="ar"/>
+        </w:rPr>
+        <w:t>Why are most objects created in Eden space?</w:t>
+      </w:r>
+    </w:p>
+    <w:p>
+      <w:pPr>
+        <w:numPr>
+          <w:ilvl w:val="0"/>
+          <w:numId w:val="10"/>
+        </w:numPr>
+        <w:rPr>
+          <w:rStyle w:val="27"/>
+          <w:rFonts w:hint="default" w:ascii="Times New Roman" w:hAnsi="Times New Roman" w:eastAsia="SimSun" w:cs="Times New Roman"/>
+          <w:b/>
+          <w:bCs/>
+          <w:sz w:val="24"/>
+          <w:szCs w:val="24"/>
+        </w:rPr>
+      </w:pPr>
+      <w:r>
+        <w:rPr>
+          <w:rFonts w:hint="eastAsia" w:ascii="SimSun" w:hAnsi="SimSun" w:eastAsia="SimSun" w:cs="SimSun"/>
+          <w:kern w:val="0"/>
+          <w:sz w:val="24"/>
+          <w:szCs w:val="24"/>
+          <w:shd w:val="clear" w:fill="FFFFFF"/>
+          <w:lang w:val="en-US" w:eastAsia="zh-CN" w:bidi="ar"/>
+        </w:rPr>
+        <w:t>Why is stack faster than heap?</w:t>
+      </w:r>
+    </w:p>
+    <w:p>
+      <w:pPr>
+        <w:numPr>
+          <w:ilvl w:val="0"/>
+          <w:numId w:val="10"/>
+        </w:numPr>
+        <w:rPr>
+          <w:rFonts w:hint="eastAsia" w:ascii="SimSun" w:hAnsi="SimSun" w:eastAsia="SimSun" w:cs="SimSun"/>
+          <w:sz w:val="24"/>
+          <w:szCs w:val="24"/>
+          <w:shd w:val="clear" w:fill="FFFFFF"/>
+        </w:rPr>
+      </w:pPr>
+      <w:r>
+        <w:rPr>
+          <w:rStyle w:val="27"/>
+          <w:rFonts w:hint="default" w:ascii="Times New Roman" w:hAnsi="Times New Roman" w:eastAsia="SimSun" w:cs="Times New Roman"/>
+          <w:b/>
+          <w:bCs/>
+          <w:sz w:val="24"/>
+          <w:szCs w:val="24"/>
+        </w:rPr>
+        <w:t>native methods</w:t>
+      </w:r>
+      <w:r>
+        <w:rPr>
+          <w:rFonts w:hint="default" w:ascii="Times New Roman" w:hAnsi="Times New Roman" w:eastAsia="SimSun" w:cs="Times New Roman"/>
+          <w:kern w:val="2"/>
+          <w:sz w:val="21"/>
+          <w:szCs w:val="21"/>
+        </w:rPr>
+        <w:t>,</w:t>
+      </w:r>
+      <w:r>
+        <w:rPr>
+          <w:rFonts w:hint="default" w:ascii="Times New Roman" w:hAnsi="Times New Roman" w:eastAsia="SimSun" w:cs="Times New Roman"/>
+          <w:kern w:val="2"/>
+          <w:sz w:val="21"/>
+          <w:szCs w:val="21"/>
+          <w:lang w:val="en-US"/>
+        </w:rPr>
+        <w:t xml:space="preserve"> WHY </w:t>
+      </w:r>
+      <w:r>
+        <w:rPr>
+          <w:rFonts w:hint="default" w:ascii="Times New Roman" w:hAnsi="Times New Roman" w:eastAsia="SimSun" w:cs="Times New Roman"/>
+          <w:kern w:val="2"/>
+          <w:sz w:val="21"/>
+          <w:szCs w:val="21"/>
+        </w:rPr>
+        <w:t xml:space="preserve"> PC Register value is </w:t>
+      </w:r>
+      <w:r>
+        <w:rPr>
+          <w:rStyle w:val="27"/>
+          <w:rFonts w:hint="default" w:ascii="Times New Roman" w:hAnsi="Times New Roman" w:eastAsia="SimSun" w:cs="Times New Roman"/>
+          <w:b/>
+          <w:bCs/>
+          <w:sz w:val="24"/>
+          <w:szCs w:val="24"/>
+        </w:rPr>
+        <w:t>undefined</w:t>
+      </w:r>
+      <w:r>
+        <w:rPr>
+          <w:rStyle w:val="27"/>
+          <w:rFonts w:hint="default" w:ascii="Times New Roman" w:hAnsi="Times New Roman" w:eastAsia="SimSun" w:cs="Times New Roman"/>
+          <w:b/>
+          <w:bCs/>
+          <w:sz w:val="24"/>
+          <w:szCs w:val="24"/>
+          <w:lang w:val="en-US"/>
+        </w:rPr>
+        <w:t>?</w:t>
+      </w:r>
+    </w:p>
+    <w:p>
+      <w:pPr>
+        <w:numPr>
+          <w:ilvl w:val="0"/>
+          <w:numId w:val="10"/>
+        </w:numPr>
+        <w:rPr>
+          <w:rFonts w:hint="eastAsia" w:ascii="SimSun" w:hAnsi="SimSun" w:eastAsia="SimSun" w:cs="SimSun"/>
+          <w:b/>
+          <w:bCs/>
+          <w:sz w:val="24"/>
+          <w:szCs w:val="24"/>
+        </w:rPr>
+      </w:pPr>
+      <w:r>
+        <w:rPr>
+          <w:rFonts w:hint="eastAsia" w:ascii="SimSun" w:hAnsi="SimSun" w:eastAsia="SimSun" w:cs="SimSun"/>
+          <w:kern w:val="0"/>
+          <w:sz w:val="24"/>
+          <w:szCs w:val="24"/>
+          <w:shd w:val="clear" w:fill="FFFFFF"/>
+          <w:lang w:val="en-US" w:eastAsia="zh-CN" w:bidi="ar"/>
+        </w:rPr>
+        <w:t>Why does JIT improve Java performance</w:t>
+      </w:r>
+    </w:p>
+    <w:p>
+      <w:pPr>
+        <w:numPr>
+          <w:ilvl w:val="0"/>
+          <w:numId w:val="10"/>
+        </w:numPr>
+        <w:rPr>
+          <w:rFonts w:hint="eastAsia" w:ascii="SimSun" w:hAnsi="SimSun" w:eastAsia="SimSun" w:cs="SimSun"/>
+          <w:kern w:val="2"/>
+          <w:sz w:val="24"/>
+          <w:szCs w:val="24"/>
+        </w:rPr>
+      </w:pPr>
+      <w:r>
+        <w:rPr>
+          <w:rFonts w:hint="eastAsia" w:ascii="SimSun" w:hAnsi="SimSun" w:eastAsia="SimSun" w:cs="SimSun"/>
+          <w:b/>
+          <w:bCs/>
+          <w:kern w:val="0"/>
+          <w:sz w:val="24"/>
+          <w:szCs w:val="24"/>
+          <w:lang w:val="en-US" w:eastAsia="zh-CN" w:bidi="ar"/>
+        </w:rPr>
+        <w:t>Why does GC impact application performance?</w:t>
+      </w:r>
+    </w:p>
+    <w:p>
+      <w:pPr>
+        <w:numPr>
+          <w:ilvl w:val="0"/>
+          <w:numId w:val="10"/>
+        </w:numPr>
+        <w:rPr>
+          <w:rFonts w:hint="eastAsia" w:ascii="SimSun" w:hAnsi="SimSun" w:eastAsia="SimSun" w:cs="SimSun"/>
+          <w:sz w:val="24"/>
+          <w:szCs w:val="24"/>
+        </w:rPr>
+      </w:pPr>
+      <w:r>
+        <w:rPr>
+          <w:rFonts w:hint="eastAsia" w:ascii="SimSun" w:hAnsi="SimSun" w:eastAsia="SimSun" w:cs="SimSun"/>
+          <w:kern w:val="2"/>
+          <w:sz w:val="24"/>
+          <w:szCs w:val="24"/>
+        </w:rPr>
+        <w:t>Why should finalize() not be used?</w:t>
+      </w:r>
+    </w:p>
+    <w:p>
+      <w:pPr>
+        <w:numPr>
+          <w:ilvl w:val="0"/>
+          <w:numId w:val="10"/>
+        </w:numPr>
+        <w:rPr>
+          <w:rFonts w:hint="eastAsia" w:ascii="SimSun" w:hAnsi="SimSun" w:eastAsia="SimSun" w:cs="SimSun"/>
+          <w:sz w:val="24"/>
+          <w:szCs w:val="24"/>
+        </w:rPr>
+      </w:pPr>
+      <w:bookmarkStart w:id="0" w:name="_GoBack"/>
+      <w:bookmarkEnd w:id="0"/>
+      <w:r>
+        <w:rPr>
+          <w:rFonts w:hint="eastAsia" w:ascii="SimSun" w:hAnsi="SimSun" w:eastAsia="SimSun" w:cs="SimSun"/>
+          <w:kern w:val="0"/>
+          <w:sz w:val="24"/>
+          <w:szCs w:val="24"/>
+          <w:lang w:val="en-US" w:eastAsia="zh-CN" w:bidi="ar"/>
+        </w:rPr>
+        <w:t>How can memory leak happen in Java despite GC</w:t>
+      </w:r>
+    </w:p>
+    <w:p>
+      <w:pPr>
+        <w:numPr>
+          <w:numId w:val="0"/>
+        </w:numPr>
+        <w:spacing w:after="160" w:line="259" w:lineRule="auto"/>
+        <w:rPr>
+          <w:rFonts w:hint="default" w:ascii="SimSun" w:hAnsi="SimSun" w:eastAsia="SimSun" w:cs="SimSun"/>
+          <w:kern w:val="2"/>
+          <w:sz w:val="24"/>
+          <w:szCs w:val="24"/>
+          <w:lang w:val="en-US"/>
+        </w:rPr>
+      </w:pPr>
     </w:p>
     <w:p>
       <w:pPr>
@@ -16814,6 +17598,22 @@
     <w:qFormat/>
     <w:uiPriority w:val="99"/>
   </w:style>
+  <w:style w:type="character" w:customStyle="1" w:styleId="27">
+    <w:name w:val="15"/>
+    <w:uiPriority w:val="0"/>
+    <w:rPr>
+      <w:rFonts w:hint="default" w:ascii="Times New Roman" w:hAnsi="Times New Roman" w:cs="Times New Roman"/>
+      <w:b/>
+      <w:bCs/>
+    </w:rPr>
+  </w:style>
+  <w:style w:type="character" w:customStyle="1" w:styleId="28">
+    <w:name w:val="10"/>
+    <w:uiPriority w:val="0"/>
+    <w:rPr>
+      <w:rFonts w:hint="default" w:ascii="Times New Roman" w:hAnsi="Times New Roman" w:cs="Times New Roman"/>
+    </w:rPr>
+  </w:style>
 </w:styles>
 </file>
 

</xml_diff>